<commit_message>
Add postural balance module to public lab
</commit_message>
<xml_diff>
--- a/Labo/Guide_etudiant_labo_squat.docx
+++ b/Labo/Guide_etudiant_labo_squat.docx
@@ -4,30 +4,31 @@
   <w:body>
     <w:p>
       <w:pPr>
-        <w:jc w:val="center"/>
+        <w:spacing w:after="80"/>
       </w:pPr>
       <w:r>
         <w:rPr>
+          <w:rFonts w:ascii="Calibri" w:hAnsi="Calibri"/>
           <w:b/>
-          <w:color w:val="1F4E79"/>
-          <w:sz w:val="40"/>
+          <w:color w:val="2E74B5"/>
+          <w:sz w:val="46"/>
         </w:rPr>
         <w:t>Laboratoire Squat_GUI</w:t>
       </w:r>
     </w:p>
     <w:p>
       <w:pPr>
-        <w:jc w:val="center"/>
+        <w:spacing w:after="320"/>
       </w:pPr>
       <w:r>
         <w:rPr>
-          <w:i/>
-          <w:sz w:val="22"/>
+          <w:rFonts w:ascii="Calibri" w:hAnsi="Calibri"/>
+          <w:color w:val="1F4D78"/>
+          <w:sz w:val="28"/>
         </w:rPr>
-        <w:t>Squat 2D, dynamique inverse et interprétation pratique</w:t>
+        <w:t>Laboratoire — Squat 2D, dynamique inverse et interprétation pratique</w:t>
       </w:r>
     </w:p>
-    <w:p/>
     <w:p>
       <w:pPr>
         <w:pStyle w:val="Heading1"/>
@@ -38,7 +39,12 @@
     </w:p>
     <w:p>
       <w:r>
-        <w:t>Ce laboratoire utilise Squat_GUI et le CLI python -m squat_gui run --backend analytical --out exports/condition_demo.csv --summary exports/condition_demo_summary.json pour relier des consignes pratiques de squat à des grandeurs biomécaniques: cinématique, dynamique inverse, CoM, CoP/ZMP, forces de réaction au sol, couples, puissances et ratios d’effort.</w:t>
+        <w:t>Ce laboratoire utilise le logiciel `Squat_GUI` et son interface CLI `python -m squat_gui` pour relier des consignes pratiques de squat à des variables biomécaniques : cinématique, dynamique inverse, CoM, CoP/ZMP, forces de réaction au sol, couples, puissances et ratios d’effort. Il introduit également la notion d’équilibre postural : une même pose basse peut ne plus être acceptable lorsque la morphologie ou la position de la barre change.</w:t>
+      </w:r>
+    </w:p>
+    <w:p>
+      <w:r>
+        <w:t>Le laboratoire est construit pour être associé à des questions dans Studium/Moodle. Les questions numériques doivent être calculées à partir des sorties produites localement avec le GUI ou la ligne de commande.</w:t>
       </w:r>
     </w:p>
     <w:p>
@@ -50,43 +56,72 @@
       </w:r>
     </w:p>
     <w:p>
-      <w:pPr>
-        <w:pStyle w:val="ListBullet"/>
-      </w:pPr>
       <w:r>
-        <w:t>Expliquer l’effet de la posture sur la distribution hanche-genou-cheville.</w:t>
+        <w:t>À la fin du laboratoire, l’étudiant devrait pouvoir :</w:t>
       </w:r>
     </w:p>
     <w:p>
       <w:pPr>
-        <w:pStyle w:val="ListBullet"/>
+        <w:pStyle w:val="ListNumber"/>
       </w:pPr>
       <w:r>
-        <w:t>Interpréter le CoM, le CoP/ZMP et le polygone d’appui.</w:t>
+        <w:t>expliquer comment la posture modifie la distribution des moments entre hanche, genou et cheville;</w:t>
       </w:r>
     </w:p>
     <w:p>
       <w:pPr>
-        <w:pStyle w:val="ListBullet"/>
+        <w:pStyle w:val="ListNumber"/>
       </w:pPr>
       <w:r>
-        <w:t>Comparer couples bruts et couples normalisés par capacité.</w:t>
+        <w:t>interpréter le CoM, le CoP/ZMP et le polygone d’appui dans une tâche de squat;</w:t>
       </w:r>
     </w:p>
     <w:p>
       <w:pPr>
-        <w:pStyle w:val="ListBullet"/>
+        <w:pStyle w:val="ListNumber"/>
       </w:pPr>
       <w:r>
-        <w:t>Analyser les effets de charge, vitesse et longueurs segmentaires.</w:t>
+        <w:t>distinguer couple brut et ratio d’effort normalisé par capacité articulaire;</w:t>
       </w:r>
     </w:p>
     <w:p>
       <w:pPr>
-        <w:pStyle w:val="ListBullet"/>
+        <w:pStyle w:val="ListNumber"/>
       </w:pPr>
       <w:r>
-        <w:t>Relier les simulations à des résultats expérimentaux publiés.</w:t>
+        <w:t>analyser l’effet de la morphologie et de la position de barre sur l’équilibre, puis proposer une compensation posturale;</w:t>
+      </w:r>
+    </w:p>
+    <w:p>
+      <w:pPr>
+        <w:pStyle w:val="ListNumber"/>
+      </w:pPr>
+      <w:r>
+        <w:t>analyser l’effet de la charge, de la vitesse et des longueurs segmentaires;</w:t>
+      </w:r>
+    </w:p>
+    <w:p>
+      <w:pPr>
+        <w:pStyle w:val="ListNumber"/>
+      </w:pPr>
+      <w:r>
+        <w:t>décomposer un moment articulaire en couple total, effet du contact et efforts inertiels/non-linéaires;</w:t>
+      </w:r>
+    </w:p>
+    <w:p>
+      <w:pPr>
+        <w:pStyle w:val="ListNumber"/>
+      </w:pPr>
+      <w:r>
+        <w:t>relier les résultats simulés à des résultats expérimentaux publiés;</w:t>
+      </w:r>
+    </w:p>
+    <w:p>
+      <w:pPr>
+        <w:pStyle w:val="ListNumber"/>
+      </w:pPr>
+      <w:r>
+        <w:t>formuler une recommandation pratique nuancée plutôt qu’une règle universelle.</w:t>
       </w:r>
     </w:p>
     <w:p>
@@ -94,44 +129,41 @@
         <w:pStyle w:val="Heading1"/>
       </w:pPr>
       <w:r>
-        <w:t>Commandes minimales</w:t>
+        <w:t>Préparation</w:t>
       </w:r>
     </w:p>
     <w:p>
       <w:r>
-        <w:t>Depuis le dossier du projet local:</w:t>
+        <w:t>Avant la séance, lire les résumés de littérature dans `docs/references_litterature.md` et répondre aux QCM de préparation.</w:t>
       </w:r>
     </w:p>
     <w:p>
       <w:r>
-        <w:t>cd /chemin/vers/Squat_GUI</w:t>
+        <w:t>Commande de base depuis la racine du projet :</w:t>
       </w:r>
+    </w:p>
+    <w:p>
+      <w:pPr>
+        <w:pStyle w:val="NoSpacing"/>
+      </w:pPr>
       <w:r>
-        <w:br/>
-      </w:r>
-      <w:r>
-        <w:t>python -m squat_gui run --backend analytical --out exports/condition_demo.csv --summary exports/condition_demo_summary.json</w:t>
+        <w:t>python -m squat_gui run --backend biorbd --out exports/condition_demo.csv --summary exports/condition_demo_summary.json</w:t>
       </w:r>
     </w:p>
     <w:p>
       <w:r>
-        <w:t>Avec les scripts fournis:</w:t>
+        <w:t>Si les scripts de ce dossier sont utilisés :</w:t>
       </w:r>
     </w:p>
     <w:p>
+      <w:pPr>
+        <w:pStyle w:val="NoSpacing"/>
+      </w:pPr>
       <w:r>
         <w:t>cd Labo</w:t>
-      </w:r>
-      <w:r>
         <w:br/>
-      </w:r>
-      <w:r>
         <w:t>python scripts/run_squat_batch.py --conditions scenarios/scenarios_labo_squat.csv --out results_labo_squat</w:t>
-      </w:r>
-      <w:r>
         <w:br/>
-      </w:r>
-      <w:r>
         <w:t>python scripts/analyse_squat_results.py --results results_labo_squat/results.csv --out results_labo_squat/summary_metrics.csv</w:t>
       </w:r>
     </w:p>
@@ -140,580 +172,7 @@
         <w:pStyle w:val="Heading1"/>
       </w:pPr>
       <w:r>
-        <w:t>Plan de laboratoire</w:t>
-      </w:r>
-    </w:p>
-    <w:tbl>
-      <w:tblPr>
-        <w:tblStyle w:val="TableGrid"/>
-        <w:tblW w:type="auto" w:w="0"/>
-        <w:jc w:val="center"/>
-        <w:tblLook w:firstColumn="1" w:firstRow="1" w:lastColumn="0" w:lastRow="0" w:noHBand="0" w:noVBand="1" w:val="04A0"/>
-      </w:tblPr>
-      <w:tblGrid>
-        <w:gridCol w:w="2550"/>
-        <w:gridCol w:w="2550"/>
-        <w:gridCol w:w="2550"/>
-        <w:gridCol w:w="2550"/>
-      </w:tblGrid>
-      <w:tr>
-        <w:tc>
-          <w:tcPr>
-            <w:tcW w:type="dxa" w:w="2550"/>
-            <w:vAlign w:val="top"/>
-            <w:shd w:fill="D9EAF7"/>
-          </w:tcPr>
-          <w:p>
-            <w:pPr>
-              <w:spacing w:after="0"/>
-            </w:pPr>
-            <w:r/>
-            <w:r>
-              <w:rPr>
-                <w:b/>
-                <w:sz w:val="18"/>
-              </w:rPr>
-              <w:t>Bloc</w:t>
-            </w:r>
-          </w:p>
-        </w:tc>
-        <w:tc>
-          <w:tcPr>
-            <w:tcW w:type="dxa" w:w="2550"/>
-            <w:vAlign w:val="top"/>
-            <w:shd w:fill="D9EAF7"/>
-          </w:tcPr>
-          <w:p>
-            <w:pPr>
-              <w:spacing w:after="0"/>
-            </w:pPr>
-            <w:r/>
-            <w:r>
-              <w:rPr>
-                <w:b/>
-                <w:sz w:val="18"/>
-              </w:rPr>
-              <w:t>Objectif</w:t>
-            </w:r>
-          </w:p>
-        </w:tc>
-        <w:tc>
-          <w:tcPr>
-            <w:tcW w:type="dxa" w:w="2550"/>
-            <w:vAlign w:val="top"/>
-            <w:shd w:fill="D9EAF7"/>
-          </w:tcPr>
-          <w:p>
-            <w:pPr>
-              <w:spacing w:after="0"/>
-            </w:pPr>
-            <w:r/>
-            <w:r>
-              <w:rPr>
-                <w:b/>
-                <w:sz w:val="18"/>
-              </w:rPr>
-              <w:t>Scénarios</w:t>
-            </w:r>
-          </w:p>
-        </w:tc>
-        <w:tc>
-          <w:tcPr>
-            <w:tcW w:type="dxa" w:w="2550"/>
-            <w:vAlign w:val="top"/>
-            <w:shd w:fill="D9EAF7"/>
-          </w:tcPr>
-          <w:p>
-            <w:pPr>
-              <w:spacing w:after="0"/>
-            </w:pPr>
-            <w:r/>
-            <w:r>
-              <w:rPr>
-                <w:b/>
-                <w:sz w:val="18"/>
-              </w:rPr>
-              <w:t>Livrable</w:t>
-            </w:r>
-          </w:p>
-        </w:tc>
-      </w:tr>
-      <w:tr>
-        <w:tc>
-          <w:tcPr>
-            <w:tcW w:type="dxa" w:w="2550"/>
-            <w:vAlign w:val="top"/>
-          </w:tcPr>
-          <w:p>
-            <w:pPr>
-              <w:spacing w:after="0"/>
-            </w:pPr>
-            <w:r/>
-            <w:r>
-              <w:rPr>
-                <w:b w:val="0"/>
-                <w:sz w:val="18"/>
-              </w:rPr>
-              <w:t>1</w:t>
-            </w:r>
-          </w:p>
-        </w:tc>
-        <w:tc>
-          <w:tcPr>
-            <w:tcW w:type="dxa" w:w="2550"/>
-            <w:vAlign w:val="top"/>
-          </w:tcPr>
-          <w:p>
-            <w:pPr>
-              <w:spacing w:after="0"/>
-            </w:pPr>
-            <w:r/>
-            <w:r>
-              <w:rPr>
-                <w:b w:val="0"/>
-                <w:sz w:val="18"/>
-              </w:rPr>
-              <w:t>Lire les sorties du GUI</w:t>
-            </w:r>
-          </w:p>
-        </w:tc>
-        <w:tc>
-          <w:tcPr>
-            <w:tcW w:type="dxa" w:w="2550"/>
-            <w:vAlign w:val="top"/>
-          </w:tcPr>
-          <w:p>
-            <w:pPr>
-              <w:spacing w:after="0"/>
-            </w:pPr>
-            <w:r/>
-            <w:r>
-              <w:rPr>
-                <w:b w:val="0"/>
-                <w:sz w:val="18"/>
-              </w:rPr>
-              <w:t>baseline</w:t>
-            </w:r>
-          </w:p>
-        </w:tc>
-        <w:tc>
-          <w:tcPr>
-            <w:tcW w:type="dxa" w:w="2550"/>
-            <w:vAlign w:val="top"/>
-          </w:tcPr>
-          <w:p>
-            <w:pPr>
-              <w:spacing w:after="0"/>
-            </w:pPr>
-            <w:r/>
-            <w:r>
-              <w:rPr>
-                <w:b w:val="0"/>
-                <w:sz w:val="18"/>
-              </w:rPr>
-              <w:t>Figure angles-moments-CoP</w:t>
-            </w:r>
-          </w:p>
-        </w:tc>
-      </w:tr>
-      <w:tr>
-        <w:tc>
-          <w:tcPr>
-            <w:tcW w:type="dxa" w:w="2550"/>
-            <w:vAlign w:val="top"/>
-          </w:tcPr>
-          <w:p>
-            <w:pPr>
-              <w:spacing w:after="0"/>
-            </w:pPr>
-            <w:r/>
-            <w:r>
-              <w:rPr>
-                <w:b w:val="0"/>
-                <w:sz w:val="18"/>
-              </w:rPr>
-              <w:t>2</w:t>
-            </w:r>
-          </w:p>
-        </w:tc>
-        <w:tc>
-          <w:tcPr>
-            <w:tcW w:type="dxa" w:w="2550"/>
-            <w:vAlign w:val="top"/>
-          </w:tcPr>
-          <w:p>
-            <w:pPr>
-              <w:spacing w:after="0"/>
-            </w:pPr>
-            <w:r/>
-            <w:r>
-              <w:rPr>
-                <w:b w:val="0"/>
-                <w:sz w:val="18"/>
-              </w:rPr>
-              <w:t>Posture hanche vs genou</w:t>
-            </w:r>
-          </w:p>
-        </w:tc>
-        <w:tc>
-          <w:tcPr>
-            <w:tcW w:type="dxa" w:w="2550"/>
-            <w:vAlign w:val="top"/>
-          </w:tcPr>
-          <w:p>
-            <w:pPr>
-              <w:spacing w:after="0"/>
-            </w:pPr>
-            <w:r/>
-            <w:r>
-              <w:rPr>
-                <w:b w:val="0"/>
-                <w:sz w:val="18"/>
-              </w:rPr>
-              <w:t>posture_knee_dominant, posture_hip_dominant</w:t>
-            </w:r>
-          </w:p>
-        </w:tc>
-        <w:tc>
-          <w:tcPr>
-            <w:tcW w:type="dxa" w:w="2550"/>
-            <w:vAlign w:val="top"/>
-          </w:tcPr>
-          <w:p>
-            <w:pPr>
-              <w:spacing w:after="0"/>
-            </w:pPr>
-            <w:r/>
-            <w:r>
-              <w:rPr>
-                <w:b w:val="0"/>
-                <w:sz w:val="18"/>
-              </w:rPr>
-              <w:t>Ratio hanche/genou et interprétation</w:t>
-            </w:r>
-          </w:p>
-        </w:tc>
-      </w:tr>
-      <w:tr>
-        <w:tc>
-          <w:tcPr>
-            <w:tcW w:type="dxa" w:w="2550"/>
-            <w:vAlign w:val="top"/>
-          </w:tcPr>
-          <w:p>
-            <w:pPr>
-              <w:spacing w:after="0"/>
-            </w:pPr>
-            <w:r/>
-            <w:r>
-              <w:rPr>
-                <w:b w:val="0"/>
-                <w:sz w:val="18"/>
-              </w:rPr>
-              <w:t>3</w:t>
-            </w:r>
-          </w:p>
-        </w:tc>
-        <w:tc>
-          <w:tcPr>
-            <w:tcW w:type="dxa" w:w="2550"/>
-            <w:vAlign w:val="top"/>
-          </w:tcPr>
-          <w:p>
-            <w:pPr>
-              <w:spacing w:after="0"/>
-            </w:pPr>
-            <w:r/>
-            <w:r>
-              <w:rPr>
-                <w:b w:val="0"/>
-                <w:sz w:val="18"/>
-              </w:rPr>
-              <w:t>Stabilité</w:t>
-            </w:r>
-          </w:p>
-        </w:tc>
-        <w:tc>
-          <w:tcPr>
-            <w:tcW w:type="dxa" w:w="2550"/>
-            <w:vAlign w:val="top"/>
-          </w:tcPr>
-          <w:p>
-            <w:pPr>
-              <w:spacing w:after="0"/>
-            </w:pPr>
-            <w:r/>
-            <w:r>
-              <w:rPr>
-                <w:b w:val="0"/>
-                <w:sz w:val="18"/>
-              </w:rPr>
-              <w:t>stability_forward, stability_backward</w:t>
-            </w:r>
-          </w:p>
-        </w:tc>
-        <w:tc>
-          <w:tcPr>
-            <w:tcW w:type="dxa" w:w="2550"/>
-            <w:vAlign w:val="top"/>
-          </w:tcPr>
-          <w:p>
-            <w:pPr>
-              <w:spacing w:after="0"/>
-            </w:pPr>
-            <w:r/>
-            <w:r>
-              <w:rPr>
-                <w:b w:val="0"/>
-                <w:sz w:val="18"/>
-              </w:rPr>
-              <w:t>CoP min/max et frames à risque</w:t>
-            </w:r>
-          </w:p>
-        </w:tc>
-      </w:tr>
-      <w:tr>
-        <w:tc>
-          <w:tcPr>
-            <w:tcW w:type="dxa" w:w="2550"/>
-            <w:vAlign w:val="top"/>
-          </w:tcPr>
-          <w:p>
-            <w:pPr>
-              <w:spacing w:after="0"/>
-            </w:pPr>
-            <w:r/>
-            <w:r>
-              <w:rPr>
-                <w:b w:val="0"/>
-                <w:sz w:val="18"/>
-              </w:rPr>
-              <w:t>4</w:t>
-            </w:r>
-          </w:p>
-        </w:tc>
-        <w:tc>
-          <w:tcPr>
-            <w:tcW w:type="dxa" w:w="2550"/>
-            <w:vAlign w:val="top"/>
-          </w:tcPr>
-          <w:p>
-            <w:pPr>
-              <w:spacing w:after="0"/>
-            </w:pPr>
-            <w:r/>
-            <w:r>
-              <w:rPr>
-                <w:b w:val="0"/>
-                <w:sz w:val="18"/>
-              </w:rPr>
-              <w:t>Charge externe</w:t>
-            </w:r>
-          </w:p>
-        </w:tc>
-        <w:tc>
-          <w:tcPr>
-            <w:tcW w:type="dxa" w:w="2550"/>
-            <w:vAlign w:val="top"/>
-          </w:tcPr>
-          <w:p>
-            <w:pPr>
-              <w:spacing w:after="0"/>
-            </w:pPr>
-            <w:r/>
-            <w:r>
-              <w:rPr>
-                <w:b w:val="0"/>
-                <w:sz w:val="18"/>
-              </w:rPr>
-              <w:t>baseline, load_25kg, load_50kg, load_75kg</w:t>
-            </w:r>
-          </w:p>
-        </w:tc>
-        <w:tc>
-          <w:tcPr>
-            <w:tcW w:type="dxa" w:w="2550"/>
-            <w:vAlign w:val="top"/>
-          </w:tcPr>
-          <w:p>
-            <w:pPr>
-              <w:spacing w:after="0"/>
-            </w:pPr>
-            <w:r/>
-            <w:r>
-              <w:rPr>
-                <w:b w:val="0"/>
-                <w:sz w:val="18"/>
-              </w:rPr>
-              <w:t>Courbe charge-effort</w:t>
-            </w:r>
-          </w:p>
-        </w:tc>
-      </w:tr>
-      <w:tr>
-        <w:tc>
-          <w:tcPr>
-            <w:tcW w:type="dxa" w:w="2550"/>
-            <w:vAlign w:val="top"/>
-          </w:tcPr>
-          <w:p>
-            <w:pPr>
-              <w:spacing w:after="0"/>
-            </w:pPr>
-            <w:r/>
-            <w:r>
-              <w:rPr>
-                <w:b w:val="0"/>
-                <w:sz w:val="18"/>
-              </w:rPr>
-              <w:t>5</w:t>
-            </w:r>
-          </w:p>
-        </w:tc>
-        <w:tc>
-          <w:tcPr>
-            <w:tcW w:type="dxa" w:w="2550"/>
-            <w:vAlign w:val="top"/>
-          </w:tcPr>
-          <w:p>
-            <w:pPr>
-              <w:spacing w:after="0"/>
-            </w:pPr>
-            <w:r/>
-            <w:r>
-              <w:rPr>
-                <w:b w:val="0"/>
-                <w:sz w:val="18"/>
-              </w:rPr>
-              <w:t>Vitesse</w:t>
-            </w:r>
-          </w:p>
-        </w:tc>
-        <w:tc>
-          <w:tcPr>
-            <w:tcW w:type="dxa" w:w="2550"/>
-            <w:vAlign w:val="top"/>
-          </w:tcPr>
-          <w:p>
-            <w:pPr>
-              <w:spacing w:after="0"/>
-            </w:pPr>
-            <w:r/>
-            <w:r>
-              <w:rPr>
-                <w:b w:val="0"/>
-                <w:sz w:val="18"/>
-              </w:rPr>
-              <w:t>duration_slow_4s, duration_fast_1s</w:t>
-            </w:r>
-          </w:p>
-        </w:tc>
-        <w:tc>
-          <w:tcPr>
-            <w:tcW w:type="dxa" w:w="2550"/>
-            <w:vAlign w:val="top"/>
-          </w:tcPr>
-          <w:p>
-            <w:pPr>
-              <w:spacing w:after="0"/>
-            </w:pPr>
-            <w:r/>
-            <w:r>
-              <w:rPr>
-                <w:b w:val="0"/>
-                <w:sz w:val="18"/>
-              </w:rPr>
-              <w:t>Part inertielle et contact</w:t>
-            </w:r>
-          </w:p>
-        </w:tc>
-      </w:tr>
-      <w:tr>
-        <w:tc>
-          <w:tcPr>
-            <w:tcW w:type="dxa" w:w="2550"/>
-            <w:vAlign w:val="top"/>
-          </w:tcPr>
-          <w:p>
-            <w:pPr>
-              <w:spacing w:after="0"/>
-            </w:pPr>
-            <w:r/>
-            <w:r>
-              <w:rPr>
-                <w:b w:val="0"/>
-                <w:sz w:val="18"/>
-              </w:rPr>
-              <w:t>6</w:t>
-            </w:r>
-          </w:p>
-        </w:tc>
-        <w:tc>
-          <w:tcPr>
-            <w:tcW w:type="dxa" w:w="2550"/>
-            <w:vAlign w:val="top"/>
-          </w:tcPr>
-          <w:p>
-            <w:pPr>
-              <w:spacing w:after="0"/>
-            </w:pPr>
-            <w:r/>
-            <w:r>
-              <w:rPr>
-                <w:b w:val="0"/>
-                <w:sz w:val="18"/>
-              </w:rPr>
-              <w:t>Mini-projet</w:t>
-            </w:r>
-          </w:p>
-        </w:tc>
-        <w:tc>
-          <w:tcPr>
-            <w:tcW w:type="dxa" w:w="2550"/>
-            <w:vAlign w:val="top"/>
-          </w:tcPr>
-          <w:p>
-            <w:pPr>
-              <w:spacing w:after="0"/>
-            </w:pPr>
-            <w:r/>
-            <w:r>
-              <w:rPr>
-                <w:b w:val="0"/>
-                <w:sz w:val="18"/>
-              </w:rPr>
-              <w:t>Scénarios libres</w:t>
-            </w:r>
-          </w:p>
-        </w:tc>
-        <w:tc>
-          <w:tcPr>
-            <w:tcW w:type="dxa" w:w="2550"/>
-            <w:vAlign w:val="top"/>
-          </w:tcPr>
-          <w:p>
-            <w:pPr>
-              <w:spacing w:after="0"/>
-            </w:pPr>
-            <w:r/>
-            <w:r>
-              <w:rPr>
-                <w:b w:val="0"/>
-                <w:sz w:val="18"/>
-              </w:rPr>
-              <w:t>Recommandation pratique argumentée</w:t>
-            </w:r>
-          </w:p>
-        </w:tc>
-      </w:tr>
-    </w:tbl>
-    <w:p/>
-    <w:p>
-      <w:pPr>
-        <w:pStyle w:val="Heading1"/>
-      </w:pPr>
-      <w:r>
-        <w:t>Questions directrices</w:t>
+        <w:t>Déroulement proposé</w:t>
       </w:r>
     </w:p>
     <w:p>
@@ -721,7 +180,17 @@
         <w:pStyle w:val="Heading2"/>
       </w:pPr>
       <w:r>
-        <w:t>Posture</w:t>
+        <w:t>Bloc 1 — Référence et lecture des sorties</w:t>
+      </w:r>
+    </w:p>
+    <w:p>
+      <w:r>
+        <w:t>Lancer une simulation baseline. Identifier les angles articulaires, les vitesses, les accélérations, les moments, les puissances, le CoM, le CoP/ZMP et les ratios d’effort.</w:t>
+      </w:r>
+    </w:p>
+    <w:p>
+      <w:r>
+        <w:t>Questions d’analyse :</w:t>
       </w:r>
     </w:p>
     <w:p>
@@ -729,31 +198,7 @@
         <w:pStyle w:val="ListBullet"/>
       </w:pPr>
       <w:r>
-        <w:t>Quelle posture augmente le ratio hanche/genou?</w:t>
-      </w:r>
-    </w:p>
-    <w:p>
-      <w:pPr>
-        <w:pStyle w:val="ListBullet"/>
-      </w:pPr>
-      <w:r>
-        <w:t>Quelle articulation devient la plus limitante?</w:t>
-      </w:r>
-    </w:p>
-    <w:p>
-      <w:pPr>
-        <w:pStyle w:val="ListBullet"/>
-      </w:pPr>
-      <w:r>
-        <w:t>La consigne pratique est-elle toujours valable?</w:t>
-      </w:r>
-    </w:p>
-    <w:p>
-      <w:pPr>
-        <w:pStyle w:val="Heading2"/>
-      </w:pPr>
-      <w:r>
-        <w:t>Stabilité</w:t>
+        <w:t>Le pic de couple au genou survient-il au point bas ou pendant la remontée?</w:t>
       </w:r>
     </w:p>
     <w:p>
@@ -769,7 +214,53 @@
         <w:pStyle w:val="ListBullet"/>
       </w:pPr>
       <w:r>
-        <w:t>Le CoM et le CoP racontent-ils la même chose?</w:t>
+        <w:t>Quelle articulation a le ratio d’effort le plus élevé?</w:t>
+      </w:r>
+    </w:p>
+    <w:p>
+      <w:pPr>
+        <w:pStyle w:val="Heading2"/>
+      </w:pPr>
+      <w:r>
+        <w:t>Bloc 2 — Posture : hanche vs genou</w:t>
+      </w:r>
+    </w:p>
+    <w:p>
+      <w:r>
+        <w:t>Comparer `posture_knee_dominant` et `posture_hip_dominant`.</w:t>
+      </w:r>
+    </w:p>
+    <w:p>
+      <w:r>
+        <w:t>Hypothèse : une posture plus verticale avec genoux avancés augmente la demande relative au genou; une posture avec tronc plus incliné augmente la demande à la hanche.</w:t>
+      </w:r>
+    </w:p>
+    <w:p>
+      <w:r>
+        <w:t>Variables à extraire : pics de couples, ratios d’effort, ratio hanche/genou, CoP min/max.</w:t>
+      </w:r>
+    </w:p>
+    <w:p>
+      <w:r>
+        <w:t>Lien littérature attendu : Fry et al. (2003), Straub &amp; Powers (2024).</w:t>
+      </w:r>
+    </w:p>
+    <w:p>
+      <w:pPr>
+        <w:pStyle w:val="Heading2"/>
+      </w:pPr>
+      <w:r>
+        <w:t>Bloc 3 — Équilibre postural : morphologie et prise de barre</w:t>
+      </w:r>
+    </w:p>
+    <w:p>
+      <w:r>
+        <w:t>Le principe de ce bloc est de tenir la pose basse constante au début de la comparaison. La charge est exprimée en pourcentage du poids de corps et vaut 40 % BW dans les essais fournis.</w:t>
+      </w:r>
+    </w:p>
+    <w:p>
+      <w:r>
+        <w:t>Comparer d’abord :</w:t>
       </w:r>
     </w:p>
     <w:p>
@@ -777,7 +268,75 @@
         <w:pStyle w:val="ListBullet"/>
       </w:pPr>
       <w:r>
-        <w:t>Une posture avec faible couple au genou est-elle forcément stable?</w:t>
+        <w:t>`balance_bar_back`, `balance_bar_front` et `balance_bar_overhead`;</w:t>
+      </w:r>
+    </w:p>
+    <w:p>
+      <w:pPr>
+        <w:pStyle w:val="ListBullet"/>
+      </w:pPr>
+      <w:r>
+        <w:t>`balance_long_thigh_back` et `balance_long_thigh_front`;</w:t>
+      </w:r>
+    </w:p>
+    <w:p>
+      <w:pPr>
+        <w:pStyle w:val="ListBullet"/>
+      </w:pPr>
+      <w:r>
+        <w:t>`balance_pregnant_back` et `balance_pregnant_front`.</w:t>
+      </w:r>
+    </w:p>
+    <w:p>
+      <w:r>
+        <w:t>Questions d’analyse :</w:t>
+      </w:r>
+    </w:p>
+    <w:p>
+      <w:pPr>
+        <w:pStyle w:val="ListBullet"/>
+      </w:pPr>
+      <w:r>
+        <w:t>À pose identique, comment la prise de barre déplace-t-elle le CoM au point bas et le CoP/ZMP pendant le mouvement?</w:t>
+      </w:r>
+    </w:p>
+    <w:p>
+      <w:pPr>
+        <w:pStyle w:val="ListBullet"/>
+      </w:pPr>
+      <w:r>
+        <w:t>Une cuisse plus longue ou le profil `femme enceinte` rend-il la même stratégie posturale plus difficile à équilibrer?</w:t>
+      </w:r>
+    </w:p>
+    <w:p>
+      <w:pPr>
+        <w:pStyle w:val="ListBullet"/>
+      </w:pPr>
+      <w:r>
+        <w:t>Dans quels cas le CoP sort-il du pied, et pendant combien de frames?</w:t>
+      </w:r>
+    </w:p>
+    <w:p>
+      <w:pPr>
+        <w:pStyle w:val="ListBullet"/>
+      </w:pPr>
+      <w:r>
+        <w:t>La prise qui améliore l’équilibre réduit-elle nécessairement le ratio d’effort de toutes les articulations?</w:t>
+      </w:r>
+    </w:p>
+    <w:p>
+      <w:r>
+        <w:t>Étape de conception : ouvrir les conditions les plus critiques dans le GUI, ajuster les angles de la position de squat jusqu’à conserver le CoP dans le pied, puis enregistrer la condition adaptée. Rapporter les changements d’angles nécessaires et leurs conséquences sur les couples.</w:t>
+      </w:r>
+    </w:p>
+    <w:p>
+      <w:r>
+        <w:t>Variables à extraire : `squat_com_x_m`, `squat_cop_x_m`, `cop_outside_foot_frames`, excursion du CoP, pics de couples et ratios d’effort.</w:t>
+      </w:r>
+    </w:p>
+    <w:p>
+      <w:r>
+        <w:t>Lien littérature attendu : Chan &amp; Sigward (2020), Kim et al. (2021), Schoenfeld (2010).</w:t>
       </w:r>
     </w:p>
     <w:p>
@@ -785,7 +344,96 @@
         <w:pStyle w:val="Heading2"/>
       </w:pPr>
       <w:r>
-        <w:t>Charge</w:t>
+        <w:t>Bloc 4 — Limites d’appui</w:t>
+      </w:r>
+    </w:p>
+    <w:p>
+      <w:r>
+        <w:t>Comparer `stability_forward` et `stability_backward`.</w:t>
+      </w:r>
+    </w:p>
+    <w:p>
+      <w:r>
+        <w:t>Hypothèse : une posture peut être biomécaniquement exigeante sans être acceptable si le CoP sort du pied.</w:t>
+      </w:r>
+    </w:p>
+    <w:p>
+      <w:r>
+        <w:t>Variables à extraire : CoP, CoM, couleur d’alerte du GUI, moments normalisés.</w:t>
+      </w:r>
+    </w:p>
+    <w:p>
+      <w:r>
+        <w:t>Lien littérature attendu : Chan &amp; Sigward (2020), Kitamura et al. (2019).</w:t>
+      </w:r>
+    </w:p>
+    <w:p>
+      <w:pPr>
+        <w:pStyle w:val="Heading2"/>
+      </w:pPr>
+      <w:r>
+        <w:t>Bloc 5 — Charge externe</w:t>
+      </w:r>
+    </w:p>
+    <w:p>
+      <w:r>
+        <w:t>Comparer `baseline`, `load_30bw`, `load_60bw` et `load_100bw`. La charge de barre est exprimée en pourcentage du poids de corps du sujet de référence de 70 kg.</w:t>
+      </w:r>
+    </w:p>
+    <w:p>
+      <w:r>
+        <w:t>Hypothèse : la charge augmente les couples et les forces de réaction au sol, mais l’articulation limitante peut dépendre des capacités maximales.</w:t>
+      </w:r>
+    </w:p>
+    <w:p>
+      <w:r>
+        <w:t>Variables à extraire : pics de couples, GRF verticale, ratios d’effort, première articulation dépassant 1.0.</w:t>
+      </w:r>
+    </w:p>
+    <w:p>
+      <w:r>
+        <w:t>Lien littérature attendu : Pürzel et al. (2025), Schoenfeld (2010).</w:t>
+      </w:r>
+    </w:p>
+    <w:p>
+      <w:pPr>
+        <w:pStyle w:val="Heading2"/>
+      </w:pPr>
+      <w:r>
+        <w:t>Bloc 6 — Durée du mouvement</w:t>
+      </w:r>
+    </w:p>
+    <w:p>
+      <w:r>
+        <w:t>Comparer `duration_slow` et `duration_fast` avec posture, charge et prise de barre constantes.</w:t>
+      </w:r>
+    </w:p>
+    <w:p>
+      <w:r>
+        <w:t>Hypothèse : réduire la durée augmente les accélérations et peut modifier la part des efforts inertiels/non-linéaires dans le couple total.</w:t>
+      </w:r>
+    </w:p>
+    <w:p>
+      <w:r>
+        <w:t>Variables à extraire : couple total de dynamique inverse, effet du contact, efforts inertiels/non-linéaires (`total - contact`) et puissance.</w:t>
+      </w:r>
+    </w:p>
+    <w:p>
+      <w:r>
+        <w:t>Lien littérature attendu : Hannan &amp; King (2022).</w:t>
+      </w:r>
+    </w:p>
+    <w:p>
+      <w:pPr>
+        <w:pStyle w:val="Heading2"/>
+      </w:pPr>
+      <w:r>
+        <w:t>Bloc 7 — Mini-projet</w:t>
+      </w:r>
+    </w:p>
+    <w:p>
+      <w:r>
+        <w:t>Chaque équipe choisit un objectif :</w:t>
       </w:r>
     </w:p>
     <w:p>
@@ -793,7 +441,7 @@
         <w:pStyle w:val="ListBullet"/>
       </w:pPr>
       <w:r>
-        <w:t>Quelle variable augmente le plus avec la charge?</w:t>
+        <w:t>minimiser la demande relative au genou;</w:t>
       </w:r>
     </w:p>
     <w:p>
@@ -801,7 +449,7 @@
         <w:pStyle w:val="ListBullet"/>
       </w:pPr>
       <w:r>
-        <w:t>Quelle articulation dépasse d’abord sa capacité?</w:t>
+        <w:t>maximiser la sollicitation du genou sans dépasser les capacités;</w:t>
       </w:r>
     </w:p>
     <w:p>
@@ -809,15 +457,7 @@
         <w:pStyle w:val="ListBullet"/>
       </w:pPr>
       <w:r>
-        <w:t>Le couple brut et le ratio d’effort mènent-ils à la même conclusion?</w:t>
-      </w:r>
-    </w:p>
-    <w:p>
-      <w:pPr>
-        <w:pStyle w:val="Heading2"/>
-      </w:pPr>
-      <w:r>
-        <w:t>Vitesse</w:t>
+        <w:t>garder le CoP au centre du pied;</w:t>
       </w:r>
     </w:p>
     <w:p>
@@ -825,7 +465,7 @@
         <w:pStyle w:val="ListBullet"/>
       </w:pPr>
       <w:r>
-        <w:t>Quelle est la part inertielle du mouvement lent?</w:t>
+        <w:t>adapter la posture pour préserver l’équilibre après un changement de morphologie ou de prise de barre;</w:t>
       </w:r>
     </w:p>
     <w:p>
@@ -833,7 +473,7 @@
         <w:pStyle w:val="ListBullet"/>
       </w:pPr>
       <w:r>
-        <w:t>Quelle est la part inertielle du mouvement rapide?</w:t>
+        <w:t>augmenter la charge sans dépasser 80 % de capacité;</w:t>
       </w:r>
     </w:p>
     <w:p>
@@ -841,7 +481,12 @@
         <w:pStyle w:val="ListBullet"/>
       </w:pPr>
       <w:r>
-        <w:t>La vitesse change-t-elle seulement l’amplitude des couples ou aussi leur composition?</w:t>
+        <w:t>augmenter la vitesse tout en limitant la part inertielle.</w:t>
+      </w:r>
+    </w:p>
+    <w:p>
+      <w:r>
+        <w:t>Le rapport doit inclure une hypothèse, un plan de simulations, une figure principale, un tableau de métriques, une interprétation pratique et au moins deux liens explicites avec la littérature.</w:t>
       </w:r>
     </w:p>
     <w:p>
@@ -854,42 +499,42 @@
     </w:p>
     <w:p>
       <w:pPr>
-        <w:pStyle w:val="ListBullet"/>
+        <w:pStyle w:val="ListNumber"/>
       </w:pPr>
       <w:r>
-        <w:t>summary_metrics.csv ou tableau équivalent.</w:t>
+        <w:t>fichier de résultats ou résumé `summary_metrics.csv`;</w:t>
       </w:r>
     </w:p>
     <w:p>
       <w:pPr>
-        <w:pStyle w:val="ListBullet"/>
+        <w:pStyle w:val="ListNumber"/>
       </w:pPr>
       <w:r>
-        <w:t>Deux figures comparatives.</w:t>
+        <w:t>figures comparatives;</w:t>
       </w:r>
     </w:p>
     <w:p>
       <w:pPr>
-        <w:pStyle w:val="ListBullet"/>
+        <w:pStyle w:val="ListNumber"/>
       </w:pPr>
       <w:r>
-        <w:t>Réponses au questionnaire ou aux questions remises par l’enseignant.</w:t>
+        <w:t>réponses au questionnaire ou aux questions remises par l’enseignant;</w:t>
       </w:r>
     </w:p>
     <w:p>
       <w:pPr>
-        <w:pStyle w:val="ListBullet"/>
+        <w:pStyle w:val="ListNumber"/>
       </w:pPr>
       <w:r>
-        <w:t>Rapport court de 2 à 4 pages.</w:t>
+        <w:t>court rapport de 2 à 4 pages;</w:t>
       </w:r>
     </w:p>
     <w:p>
       <w:pPr>
-        <w:pStyle w:val="ListBullet"/>
+        <w:pStyle w:val="ListNumber"/>
       </w:pPr>
       <w:r>
-        <w:t>Conclusion pratique fondée sur les simulations et au moins deux articles.</w:t>
+        <w:t>conclusion pratique : que peut-on recommander, et à quelles conditions?</w:t>
       </w:r>
     </w:p>
     <w:p>
@@ -897,36 +542,41 @@
         <w:pStyle w:val="Heading1"/>
       </w:pPr>
       <w:r>
-        <w:t>Grille d’évaluation</w:t>
+        <w:t>Critères d’évaluation</w:t>
       </w:r>
     </w:p>
     <w:tbl>
       <w:tblPr>
         <w:tblStyle w:val="TableGrid"/>
-        <w:tblW w:type="auto" w:w="0"/>
+        <w:tblW w:type="dxa" w:w="9360"/>
         <w:jc w:val="center"/>
+        <w:tblLayout w:type="fixed"/>
         <w:tblLook w:firstColumn="1" w:firstRow="1" w:lastColumn="0" w:lastRow="0" w:noHBand="0" w:noVBand="1" w:val="04A0"/>
       </w:tblPr>
       <w:tblGrid>
-        <w:gridCol w:w="5100"/>
-        <w:gridCol w:w="5100"/>
+        <w:gridCol w:w="7300"/>
+        <w:gridCol w:w="2060"/>
       </w:tblGrid>
       <w:tr>
+        <w:trPr>
+          <w:tblHeader w:val="true"/>
+        </w:trPr>
         <w:tc>
           <w:tcPr>
-            <w:tcW w:type="dxa" w:w="5100"/>
-            <w:vAlign w:val="top"/>
-            <w:shd w:fill="D9EAF7"/>
+            <w:tcW w:type="dxa" w:w="7300"/>
+            <w:tcMar>
+              <w:top w:w="80" w:type="dxa"/>
+              <w:bottom w:w="80" w:type="dxa"/>
+              <w:start w:w="120" w:type="dxa"/>
+              <w:end w:w="120" w:type="dxa"/>
+            </w:tcMar>
+            <w:vAlign w:val="center"/>
+            <w:shd w:fill="E8EEF5"/>
           </w:tcPr>
           <w:p>
-            <w:pPr>
-              <w:spacing w:after="0"/>
-            </w:pPr>
-            <w:r/>
             <w:r>
               <w:rPr>
                 <w:b/>
-                <w:sz w:val="18"/>
               </w:rPr>
               <w:t>Critère</w:t>
             </w:r>
@@ -934,19 +584,20 @@
         </w:tc>
         <w:tc>
           <w:tcPr>
-            <w:tcW w:type="dxa" w:w="5100"/>
-            <w:vAlign w:val="top"/>
-            <w:shd w:fill="D9EAF7"/>
+            <w:tcW w:type="dxa" w:w="2060"/>
+            <w:tcMar>
+              <w:top w:w="80" w:type="dxa"/>
+              <w:bottom w:w="80" w:type="dxa"/>
+              <w:start w:w="120" w:type="dxa"/>
+              <w:end w:w="120" w:type="dxa"/>
+            </w:tcMar>
+            <w:vAlign w:val="center"/>
+            <w:shd w:fill="E8EEF5"/>
           </w:tcPr>
           <w:p>
-            <w:pPr>
-              <w:spacing w:after="0"/>
-            </w:pPr>
-            <w:r/>
             <w:r>
               <w:rPr>
                 <w:b/>
-                <w:sz w:val="18"/>
               </w:rPr>
               <w:t>Points</w:t>
             </w:r>
@@ -956,39 +607,35 @@
       <w:tr>
         <w:tc>
           <w:tcPr>
-            <w:tcW w:type="dxa" w:w="5100"/>
-            <w:vAlign w:val="top"/>
+            <w:tcW w:type="dxa" w:w="7300"/>
+            <w:tcMar>
+              <w:top w:w="80" w:type="dxa"/>
+              <w:bottom w:w="80" w:type="dxa"/>
+              <w:start w:w="120" w:type="dxa"/>
+              <w:end w:w="120" w:type="dxa"/>
+            </w:tcMar>
+            <w:vAlign w:val="center"/>
           </w:tcPr>
           <w:p>
-            <w:pPr>
-              <w:spacing w:after="0"/>
-            </w:pPr>
-            <w:r/>
             <w:r>
-              <w:rPr>
-                <w:b w:val="0"/>
-                <w:sz w:val="18"/>
-              </w:rPr>
-              <w:t>Simulations reproductibles et comparaisons équitables</w:t>
+              <w:t>Simulations reproductibles et bien comparées</w:t>
             </w:r>
           </w:p>
         </w:tc>
         <w:tc>
           <w:tcPr>
-            <w:tcW w:type="dxa" w:w="5100"/>
-            <w:vAlign w:val="top"/>
+            <w:tcW w:type="dxa" w:w="2060"/>
+            <w:tcMar>
+              <w:top w:w="80" w:type="dxa"/>
+              <w:bottom w:w="80" w:type="dxa"/>
+              <w:start w:w="120" w:type="dxa"/>
+              <w:end w:w="120" w:type="dxa"/>
+            </w:tcMar>
+            <w:vAlign w:val="center"/>
           </w:tcPr>
           <w:p>
-            <w:pPr>
-              <w:spacing w:after="0"/>
-            </w:pPr>
-            <w:r/>
             <w:r>
-              <w:rPr>
-                <w:b w:val="0"/>
-                <w:sz w:val="18"/>
-              </w:rPr>
-              <w:t>25</w:t>
+              <w:t>20</w:t>
             </w:r>
           </w:p>
         </w:tc>
@@ -996,39 +643,35 @@
       <w:tr>
         <w:tc>
           <w:tcPr>
-            <w:tcW w:type="dxa" w:w="5100"/>
-            <w:vAlign w:val="top"/>
+            <w:tcW w:type="dxa" w:w="7300"/>
+            <w:tcMar>
+              <w:top w:w="80" w:type="dxa"/>
+              <w:bottom w:w="80" w:type="dxa"/>
+              <w:start w:w="120" w:type="dxa"/>
+              <w:end w:w="120" w:type="dxa"/>
+            </w:tcMar>
+            <w:vAlign w:val="center"/>
           </w:tcPr>
           <w:p>
-            <w:pPr>
-              <w:spacing w:after="0"/>
-            </w:pPr>
-            <w:r/>
             <w:r>
-              <w:rPr>
-                <w:b w:val="0"/>
-                <w:sz w:val="18"/>
-              </w:rPr>
               <w:t>Analyse des moments, CoP/ZMP et ratios d’effort</w:t>
             </w:r>
           </w:p>
         </w:tc>
         <w:tc>
           <w:tcPr>
-            <w:tcW w:type="dxa" w:w="5100"/>
-            <w:vAlign w:val="top"/>
+            <w:tcW w:type="dxa" w:w="2060"/>
+            <w:tcMar>
+              <w:top w:w="80" w:type="dxa"/>
+              <w:bottom w:w="80" w:type="dxa"/>
+              <w:start w:w="120" w:type="dxa"/>
+              <w:end w:w="120" w:type="dxa"/>
+            </w:tcMar>
+            <w:vAlign w:val="center"/>
           </w:tcPr>
           <w:p>
-            <w:pPr>
-              <w:spacing w:after="0"/>
-            </w:pPr>
-            <w:r/>
             <w:r>
-              <w:rPr>
-                <w:b w:val="0"/>
-                <w:sz w:val="18"/>
-              </w:rPr>
-              <w:t>25</w:t>
+              <w:t>20</w:t>
             </w:r>
           </w:p>
         </w:tc>
@@ -1036,38 +679,34 @@
       <w:tr>
         <w:tc>
           <w:tcPr>
-            <w:tcW w:type="dxa" w:w="5100"/>
-            <w:vAlign w:val="top"/>
+            <w:tcW w:type="dxa" w:w="7300"/>
+            <w:tcMar>
+              <w:top w:w="80" w:type="dxa"/>
+              <w:bottom w:w="80" w:type="dxa"/>
+              <w:start w:w="120" w:type="dxa"/>
+              <w:end w:w="120" w:type="dxa"/>
+            </w:tcMar>
+            <w:vAlign w:val="center"/>
           </w:tcPr>
           <w:p>
-            <w:pPr>
-              <w:spacing w:after="0"/>
-            </w:pPr>
-            <w:r/>
             <w:r>
-              <w:rPr>
-                <w:b w:val="0"/>
-                <w:sz w:val="18"/>
-              </w:rPr>
-              <w:t>Analyse dynamique Mqddot, contact et vitesse</w:t>
+              <w:t>Équilibre morphologie / prise de barre et adaptation proposée</w:t>
             </w:r>
           </w:p>
         </w:tc>
         <w:tc>
           <w:tcPr>
-            <w:tcW w:type="dxa" w:w="5100"/>
-            <w:vAlign w:val="top"/>
+            <w:tcW w:type="dxa" w:w="2060"/>
+            <w:tcMar>
+              <w:top w:w="80" w:type="dxa"/>
+              <w:bottom w:w="80" w:type="dxa"/>
+              <w:start w:w="120" w:type="dxa"/>
+              <w:end w:w="120" w:type="dxa"/>
+            </w:tcMar>
+            <w:vAlign w:val="center"/>
           </w:tcPr>
           <w:p>
-            <w:pPr>
-              <w:spacing w:after="0"/>
-            </w:pPr>
-            <w:r/>
             <w:r>
-              <w:rPr>
-                <w:b w:val="0"/>
-                <w:sz w:val="18"/>
-              </w:rPr>
               <w:t>15</w:t>
             </w:r>
           </w:p>
@@ -1076,38 +715,70 @@
       <w:tr>
         <w:tc>
           <w:tcPr>
-            <w:tcW w:type="dxa" w:w="5100"/>
-            <w:vAlign w:val="top"/>
+            <w:tcW w:type="dxa" w:w="7300"/>
+            <w:tcMar>
+              <w:top w:w="80" w:type="dxa"/>
+              <w:bottom w:w="80" w:type="dxa"/>
+              <w:start w:w="120" w:type="dxa"/>
+              <w:end w:w="120" w:type="dxa"/>
+            </w:tcMar>
+            <w:vAlign w:val="center"/>
           </w:tcPr>
           <w:p>
-            <w:pPr>
-              <w:spacing w:after="0"/>
-            </w:pPr>
-            <w:r/>
             <w:r>
-              <w:rPr>
-                <w:b w:val="0"/>
-                <w:sz w:val="18"/>
-              </w:rPr>
+              <w:t>Analyse dynamique total, contact, inertiels/non-linéaires et durée</w:t>
+            </w:r>
+          </w:p>
+        </w:tc>
+        <w:tc>
+          <w:tcPr>
+            <w:tcW w:type="dxa" w:w="2060"/>
+            <w:tcMar>
+              <w:top w:w="80" w:type="dxa"/>
+              <w:bottom w:w="80" w:type="dxa"/>
+              <w:start w:w="120" w:type="dxa"/>
+              <w:end w:w="120" w:type="dxa"/>
+            </w:tcMar>
+            <w:vAlign w:val="center"/>
+          </w:tcPr>
+          <w:p>
+            <w:r>
+              <w:t>10</w:t>
+            </w:r>
+          </w:p>
+        </w:tc>
+      </w:tr>
+      <w:tr>
+        <w:tc>
+          <w:tcPr>
+            <w:tcW w:type="dxa" w:w="7300"/>
+            <w:tcMar>
+              <w:top w:w="80" w:type="dxa"/>
+              <w:bottom w:w="80" w:type="dxa"/>
+              <w:start w:w="120" w:type="dxa"/>
+              <w:end w:w="120" w:type="dxa"/>
+            </w:tcMar>
+            <w:vAlign w:val="center"/>
+          </w:tcPr>
+          <w:p>
+            <w:r>
               <w:t>Utilisation pertinente de la littérature</w:t>
             </w:r>
           </w:p>
         </w:tc>
         <w:tc>
           <w:tcPr>
-            <w:tcW w:type="dxa" w:w="5100"/>
-            <w:vAlign w:val="top"/>
+            <w:tcW w:type="dxa" w:w="2060"/>
+            <w:tcMar>
+              <w:top w:w="80" w:type="dxa"/>
+              <w:bottom w:w="80" w:type="dxa"/>
+              <w:start w:w="120" w:type="dxa"/>
+              <w:end w:w="120" w:type="dxa"/>
+            </w:tcMar>
+            <w:vAlign w:val="center"/>
           </w:tcPr>
           <w:p>
-            <w:pPr>
-              <w:spacing w:after="0"/>
-            </w:pPr>
-            <w:r/>
             <w:r>
-              <w:rPr>
-                <w:b w:val="0"/>
-                <w:sz w:val="18"/>
-              </w:rPr>
               <w:t>20</w:t>
             </w:r>
           </w:p>
@@ -1116,38 +787,34 @@
       <w:tr>
         <w:tc>
           <w:tcPr>
-            <w:tcW w:type="dxa" w:w="5100"/>
-            <w:vAlign w:val="top"/>
+            <w:tcW w:type="dxa" w:w="7300"/>
+            <w:tcMar>
+              <w:top w:w="80" w:type="dxa"/>
+              <w:bottom w:w="80" w:type="dxa"/>
+              <w:start w:w="120" w:type="dxa"/>
+              <w:end w:w="120" w:type="dxa"/>
+            </w:tcMar>
+            <w:vAlign w:val="center"/>
           </w:tcPr>
           <w:p>
-            <w:pPr>
-              <w:spacing w:after="0"/>
-            </w:pPr>
-            <w:r/>
             <w:r>
-              <w:rPr>
-                <w:b w:val="0"/>
-                <w:sz w:val="18"/>
-              </w:rPr>
               <w:t>Recommandation pratique nuancée</w:t>
             </w:r>
           </w:p>
         </w:tc>
         <w:tc>
           <w:tcPr>
-            <w:tcW w:type="dxa" w:w="5100"/>
-            <w:vAlign w:val="top"/>
+            <w:tcW w:type="dxa" w:w="2060"/>
+            <w:tcMar>
+              <w:top w:w="80" w:type="dxa"/>
+              <w:bottom w:w="80" w:type="dxa"/>
+              <w:start w:w="120" w:type="dxa"/>
+              <w:end w:w="120" w:type="dxa"/>
+            </w:tcMar>
+            <w:vAlign w:val="center"/>
           </w:tcPr>
           <w:p>
-            <w:pPr>
-              <w:spacing w:after="0"/>
-            </w:pPr>
-            <w:r/>
             <w:r>
-              <w:rPr>
-                <w:b w:val="0"/>
-                <w:sz w:val="18"/>
-              </w:rPr>
               <w:t>10</w:t>
             </w:r>
           </w:p>
@@ -1156,38 +823,34 @@
       <w:tr>
         <w:tc>
           <w:tcPr>
-            <w:tcW w:type="dxa" w:w="5100"/>
-            <w:vAlign w:val="top"/>
+            <w:tcW w:type="dxa" w:w="7300"/>
+            <w:tcMar>
+              <w:top w:w="80" w:type="dxa"/>
+              <w:bottom w:w="80" w:type="dxa"/>
+              <w:start w:w="120" w:type="dxa"/>
+              <w:end w:w="120" w:type="dxa"/>
+            </w:tcMar>
+            <w:vAlign w:val="center"/>
           </w:tcPr>
           <w:p>
-            <w:pPr>
-              <w:spacing w:after="0"/>
-            </w:pPr>
-            <w:r/>
             <w:r>
-              <w:rPr>
-                <w:b w:val="0"/>
-                <w:sz w:val="18"/>
-              </w:rPr>
               <w:t>Clarté des figures et tableaux</w:t>
             </w:r>
           </w:p>
         </w:tc>
         <w:tc>
           <w:tcPr>
-            <w:tcW w:type="dxa" w:w="5100"/>
-            <w:vAlign w:val="top"/>
+            <w:tcW w:type="dxa" w:w="2060"/>
+            <w:tcMar>
+              <w:top w:w="80" w:type="dxa"/>
+              <w:bottom w:w="80" w:type="dxa"/>
+              <w:start w:w="120" w:type="dxa"/>
+              <w:end w:w="120" w:type="dxa"/>
+            </w:tcMar>
+            <w:vAlign w:val="center"/>
           </w:tcPr>
           <w:p>
-            <w:pPr>
-              <w:spacing w:after="0"/>
-            </w:pPr>
-            <w:r/>
             <w:r>
-              <w:rPr>
-                <w:b w:val="0"/>
-                <w:sz w:val="18"/>
-              </w:rPr>
               <w:t>5</w:t>
             </w:r>
           </w:p>
@@ -1195,62 +858,34 @@
       </w:tr>
     </w:tbl>
     <w:p/>
-    <w:p>
-      <w:pPr>
-        <w:pStyle w:val="Heading1"/>
-      </w:pPr>
-      <w:r>
-        <w:t>Références de départ</w:t>
-      </w:r>
-    </w:p>
-    <w:p>
-      <w:r>
-        <w:t>Fry, A. C., Smith, J. C., &amp; Schilling, B. K. (2003). Effect of knee position on hip and knee torques during the barbell squat. Journal of Strength and Conditioning Research, 17(4), 629–633.</w:t>
-      </w:r>
-    </w:p>
-    <w:p>
-      <w:r>
-        <w:t>Straub, R. K., &amp; Powers, C. M. (2024). A biomechanical review of the squat exercise: Implications for clinical practice. International Journal of Sports Physical Therapy, 19(4), 490–501.</w:t>
-      </w:r>
-    </w:p>
-    <w:p>
-      <w:r>
-        <w:t>Chan, M.-S. M., &amp; Sigward, S. M. (2020). Center of pressure predicts intra-limb compensatory patterns that shift demands away from knee extensors during squatting. Journal of Biomechanics, 111, 110008.</w:t>
-      </w:r>
-    </w:p>
-    <w:p>
-      <w:r>
-        <w:t>Kitamura, T., Kido, A., Ishida, Y., Kobayashi, Y., Tsukamoto, S., &amp; Tanaka, Y. (2019). Muscle activity pattern with a shifted center of pressure during the squat exercise. Journal of Sports Science &amp; Medicine, 18(2), 248–252.</w:t>
-      </w:r>
-    </w:p>
-    <w:p>
-      <w:r>
-        <w:t>Pürzel, A., Kaufmann, P., Koller, W., Wallnöfer, E. K., Baca, A., &amp; Kainz, H. (2025). Biomechanical analysis of hip, knee, and ankle joint contact forces during squats in elite powerlifters. PLOS ONE, 20(7), e0327973.</w:t>
-      </w:r>
-    </w:p>
-    <w:p>
-      <w:r>
-        <w:t>Hannan, K. B., &amp; King, A. C. (2022). Lower limb ground reaction force and center of pressure asymmetry during bodyweight squats. International Journal of Sports Physical Therapy, 17(6), 1075–1082.</w:t>
-      </w:r>
-    </w:p>
-    <w:p>
-      <w:r>
-        <w:t>Schoenfeld, B. J. (2010). Squatting kinematics and kinetics and their application to exercise performance. Journal of Strength and Conditioning Research, 24(12), 3497–3506.</w:t>
-      </w:r>
-    </w:p>
-    <w:p>
-      <w:r>
-        <w:t>Kim, S., Miller, M., Tallarico, A., Helder, S., Liu, Y., &amp; Lee, S. (2021). Relationships between physical characteristics and biomechanics of lower extremity during the squat. Journal of Exercise Science &amp; Fitness, 20(1), 1–7.</w:t>
-      </w:r>
-    </w:p>
     <w:sectPr>
+      <w:footerReference w:type="default" r:id="rId9"/>
       <w:pgSz w:w="12240" w:h="15840"/>
-      <w:pgMar w:top="1020" w:right="1020" w:bottom="1020" w:left="1020" w:header="720" w:footer="720" w:gutter="0"/>
+      <w:pgMar w:top="1440" w:right="1440" w:bottom="1440" w:left="1440" w:header="708" w:footer="708" w:gutter="0"/>
       <w:cols w:space="720"/>
       <w:docGrid w:linePitch="360"/>
     </w:sectPr>
   </w:body>
 </w:document>
+</file>
+
+<file path=word/footer1.xml><?xml version="1.0" encoding="utf-8"?>
+<w:ftr xmlns:m="http://schemas.openxmlformats.org/officeDocument/2006/math" xmlns:mc="http://schemas.openxmlformats.org/markup-compatibility/2006" xmlns:mo="http://schemas.microsoft.com/office/mac/office/2008/main" xmlns:mv="urn:schemas-microsoft-com:mac:vml" xmlns:o="urn:schemas-microsoft-com:office:office" xmlns:r="http://schemas.openxmlformats.org/officeDocument/2006/relationships" xmlns:v="urn:schemas-microsoft-com:vml" xmlns:w10="urn:schemas-microsoft-com:office:word" xmlns:w14="http://schemas.microsoft.com/office/word/2010/wordml" xmlns:w="http://schemas.openxmlformats.org/wordprocessingml/2006/main" xmlns:wne="http://schemas.microsoft.com/office/word/2006/wordml" xmlns:wp14="http://schemas.microsoft.com/office/word/2010/wordprocessingDrawing" xmlns:wp="http://schemas.openxmlformats.org/drawingml/2006/wordprocessingDrawing" xmlns:wpc="http://schemas.microsoft.com/office/word/2010/wordprocessingCanvas" xmlns:wpg="http://schemas.microsoft.com/office/word/2010/wordprocessingGroup" xmlns:wpi="http://schemas.microsoft.com/office/word/2010/wordprocessingInk" xmlns:wps="http://schemas.microsoft.com/office/word/2010/wordprocessingShape" mc:Ignorable="w14 wp14">
+  <w:p>
+    <w:pPr>
+      <w:pStyle w:val="Footer"/>
+      <w:jc w:val="right"/>
+    </w:pPr>
+    <w:r>
+      <w:rPr>
+        <w:rFonts w:ascii="Calibri" w:hAnsi="Calibri"/>
+        <w:color w:val="666666"/>
+        <w:sz w:val="18"/>
+      </w:rPr>
+      <w:t>Guide étudiant | Squat_GUI</w:t>
+    </w:r>
+  </w:p>
+</w:ftr>
 </file>
 
 <file path=word/numbering.xml><?xml version="1.0" encoding="utf-8"?>
@@ -1616,9 +1251,12 @@
     <w:name w:val="Normal"/>
     <w:qFormat/>
     <w:rsid w:val="00FC693F"/>
+    <w:pPr>
+      <w:spacing w:before="0" w:after="120" w:line="300" w:lineRule="auto"/>
+    </w:pPr>
     <w:rPr>
-      <w:rFonts w:ascii="Aptos" w:hAnsi="Aptos"/>
-      <w:sz w:val="20"/>
+      <w:rFonts w:ascii="Calibri" w:hAnsi="Calibri"/>
+      <w:sz w:val="22"/>
     </w:rPr>
   </w:style>
   <w:style w:type="paragraph" w:styleId="Header">
@@ -1676,14 +1314,14 @@
     <w:pPr>
       <w:keepNext/>
       <w:keepLines/>
-      <w:spacing w:before="480" w:after="0"/>
+      <w:spacing w:before="360" w:after="200"/>
       <w:outlineLvl w:val="0"/>
     </w:pPr>
     <w:rPr>
-      <w:rFonts w:asciiTheme="majorHAnsi" w:eastAsiaTheme="majorEastAsia" w:hAnsiTheme="majorHAnsi" w:cstheme="majorBidi" w:ascii="Aptos" w:hAnsi="Aptos"/>
+      <w:rFonts w:asciiTheme="majorHAnsi" w:eastAsiaTheme="majorEastAsia" w:hAnsiTheme="majorHAnsi" w:cstheme="majorBidi" w:ascii="Calibri" w:hAnsi="Calibri"/>
       <w:b/>
       <w:bCs/>
-      <w:color w:val="365F91" w:themeColor="accent1" w:themeShade="BF"/>
+      <w:color w:val="2E74B5"/>
       <w:sz w:val="32"/>
       <w:szCs w:val="28"/>
     </w:rPr>
@@ -1700,14 +1338,14 @@
     <w:pPr>
       <w:keepNext/>
       <w:keepLines/>
-      <w:spacing w:before="200" w:after="0"/>
+      <w:spacing w:before="280" w:after="140"/>
       <w:outlineLvl w:val="1"/>
     </w:pPr>
     <w:rPr>
-      <w:rFonts w:asciiTheme="majorHAnsi" w:eastAsiaTheme="majorEastAsia" w:hAnsiTheme="majorHAnsi" w:cstheme="majorBidi" w:ascii="Aptos" w:hAnsi="Aptos"/>
+      <w:rFonts w:asciiTheme="majorHAnsi" w:eastAsiaTheme="majorEastAsia" w:hAnsiTheme="majorHAnsi" w:cstheme="majorBidi" w:ascii="Calibri" w:hAnsi="Calibri"/>
       <w:b/>
       <w:bCs/>
-      <w:color w:val="4F81BD" w:themeColor="accent1"/>
+      <w:color w:val="2E74B5"/>
       <w:sz w:val="26"/>
       <w:szCs w:val="26"/>
     </w:rPr>
@@ -1724,15 +1362,15 @@
     <w:pPr>
       <w:keepNext/>
       <w:keepLines/>
-      <w:spacing w:before="200" w:after="0"/>
+      <w:spacing w:before="200" w:after="100"/>
       <w:outlineLvl w:val="2"/>
     </w:pPr>
     <w:rPr>
-      <w:rFonts w:asciiTheme="majorHAnsi" w:eastAsiaTheme="majorEastAsia" w:hAnsiTheme="majorHAnsi" w:cstheme="majorBidi" w:ascii="Aptos" w:hAnsi="Aptos"/>
+      <w:rFonts w:asciiTheme="majorHAnsi" w:eastAsiaTheme="majorEastAsia" w:hAnsiTheme="majorHAnsi" w:cstheme="majorBidi" w:ascii="Calibri" w:hAnsi="Calibri"/>
       <w:b/>
       <w:bCs/>
-      <w:color w:val="4F81BD" w:themeColor="accent1"/>
-      <w:sz w:val="22"/>
+      <w:color w:val="1F4D78"/>
+      <w:sz w:val="24"/>
     </w:rPr>
   </w:style>
   <w:style w:type="paragraph" w:styleId="Heading4">
@@ -1908,8 +1546,13 @@
     <w:qFormat/>
     <w:rsid w:val="00FC693F"/>
     <w:pPr>
-      <w:spacing w:after="0" w:line="240" w:lineRule="auto"/>
-    </w:pPr>
+      <w:spacing w:after="160" w:line="240" w:lineRule="auto"/>
+      <w:ind w:left="259"/>
+    </w:pPr>
+    <w:rPr>
+      <w:rFonts w:ascii="Consolas" w:hAnsi="Consolas"/>
+      <w:sz w:val="18"/>
+    </w:rPr>
   </w:style>
   <w:style w:type="character" w:customStyle="1" w:styleId="Heading1Char">
     <w:name w:val="Heading 1 Char"/>
@@ -2148,8 +1791,14 @@
       <w:numPr>
         <w:numId w:val="1"/>
       </w:numPr>
+      <w:spacing w:after="80" w:line="300" w:lineRule="auto"/>
+      <w:ind w:left="540" w:hanging="271"/>
       <w:contextualSpacing/>
     </w:pPr>
+    <w:rPr>
+      <w:rFonts w:ascii="Calibri" w:hAnsi="Calibri"/>
+      <w:sz w:val="22"/>
+    </w:rPr>
   </w:style>
   <w:style w:type="paragraph" w:styleId="ListBullet2">
     <w:name w:val="List Bullet 2"/>
@@ -2187,8 +1836,14 @@
       <w:numPr>
         <w:numId w:val="5"/>
       </w:numPr>
+      <w:spacing w:after="80" w:line="300" w:lineRule="auto"/>
+      <w:ind w:left="540" w:hanging="271"/>
       <w:contextualSpacing/>
     </w:pPr>
+    <w:rPr>
+      <w:rFonts w:ascii="Calibri" w:hAnsi="Calibri"/>
+      <w:sz w:val="22"/>
+    </w:rPr>
   </w:style>
   <w:style w:type="paragraph" w:styleId="ListNumber2">
     <w:name w:val="List Number 2"/>

</xml_diff>

<commit_message>
Tighten posterior ZMP support criterion
</commit_message>
<xml_diff>
--- a/Labo/Guide_etudiant_labo_squat.docx
+++ b/Labo/Guide_etudiant_labo_squat.docx
@@ -73,7 +73,7 @@
         <w:pStyle w:val="ListNumber"/>
       </w:pPr>
       <w:r>
-        <w:t>interpréter le CoM, le CoP/ZMP et le polygone d’appui dans une tâche de squat;</w:t>
+        <w:t>interpréter le CoM, le CoP/ZMP et la zone d’appui fonctionnelle dans une tâche de squat;</w:t>
       </w:r>
     </w:p>
     <w:p>
@@ -206,7 +206,7 @@
         <w:pStyle w:val="ListBullet"/>
       </w:pPr>
       <w:r>
-        <w:t>Le CoP reste-t-il dans le pied?</w:t>
+        <w:t>Le ZMP reste-t-il dans la zone d’appui fonctionnelle?</w:t>
       </w:r>
     </w:p>
     <w:p>
@@ -313,7 +313,7 @@
         <w:pStyle w:val="ListBullet"/>
       </w:pPr>
       <w:r>
-        <w:t>Dans quels cas le CoP sort-il du pied, et pendant combien de frames?</w:t>
+        <w:t>Dans quels cas le ZMP sort-il de la zone d’appui, et pendant combien de frames?</w:t>
       </w:r>
     </w:p>
     <w:p>
@@ -326,12 +326,12 @@
     </w:p>
     <w:p>
       <w:r>
-        <w:t>Étape de conception : ouvrir les conditions les plus critiques dans le GUI, ajuster les angles de la position de squat jusqu’à conserver le CoP dans le pied, puis enregistrer la condition adaptée. Rapporter les changements d’angles nécessaires et leurs conséquences sur les couples.</w:t>
+        <w:t>Étape de conception : ouvrir les conditions les plus critiques dans le GUI, ajuster les angles de la position de squat jusqu’à conserver le ZMP dans la zone d’appui, puis enregistrer la condition adaptée. La zone retenue exclut les 15 % postérieurs de la projection du pied : le bord du talon constitue une alerte, même si le point est encore sous la silhouette du pied. Rapporter les changements d’angles nécessaires et leurs conséquences sur les couples.</w:t>
       </w:r>
     </w:p>
     <w:p>
       <w:r>
-        <w:t>Variables à extraire : `squat_com_x_m`, `squat_cop_x_m`, `cop_outside_foot_frames`, excursion du CoP, pics de couples et ratios d’effort.</w:t>
+        <w:t>Variables à extraire : `squat_com_x_m`, `squat_cop_x_m`, `zmp_outside_support_frames`, excursion du ZMP, pics de couples et ratios d’effort.</w:t>
       </w:r>
     </w:p>
     <w:p>
@@ -354,12 +354,12 @@
     </w:p>
     <w:p>
       <w:r>
-        <w:t>Hypothèse : une posture peut être biomécaniquement exigeante sans être acceptable si le CoP sort du pied.</w:t>
+        <w:t>Hypothèse : une posture peut être biomécaniquement exigeante sans être acceptable si le ZMP sort de la zone d’appui fonctionnelle.</w:t>
       </w:r>
     </w:p>
     <w:p>
       <w:r>
-        <w:t>Variables à extraire : CoP, CoM, couleur d’alerte du GUI, moments normalisés.</w:t>
+        <w:t>Variables à extraire : ZMP, CoM, couleur d’alerte du GUI, moments normalisés.</w:t>
       </w:r>
     </w:p>
     <w:p>

</xml_diff>

<commit_message>
Prepare Squat GUI 0.2.0 release candidate
</commit_message>
<xml_diff>
--- a/Labo/Guide_etudiant_labo_squat.docx
+++ b/Labo/Guide_etudiant_labo_squat.docx
@@ -4,28 +4,9 @@
   <w:body>
     <w:p>
       <w:pPr>
-        <w:spacing w:after="80"/>
+        <w:pStyle w:val="Title"/>
       </w:pPr>
       <w:r>
-        <w:rPr>
-          <w:rFonts w:ascii="Calibri" w:hAnsi="Calibri"/>
-          <w:b/>
-          <w:color w:val="2E74B5"/>
-          <w:sz w:val="46"/>
-        </w:rPr>
-        <w:t>Laboratoire Squat_GUI</w:t>
-      </w:r>
-    </w:p>
-    <w:p>
-      <w:pPr>
-        <w:spacing w:after="320"/>
-      </w:pPr>
-      <w:r>
-        <w:rPr>
-          <w:rFonts w:ascii="Calibri" w:hAnsi="Calibri"/>
-          <w:color w:val="1F4D78"/>
-          <w:sz w:val="28"/>
-        </w:rPr>
         <w:t>Laboratoire — Squat 2D, dynamique inverse et interprétation pratique</w:t>
       </w:r>
     </w:p>
@@ -39,7 +20,29 @@
     </w:p>
     <w:p>
       <w:r>
-        <w:t>Ce laboratoire utilise le logiciel `Squat_GUI` et son interface CLI `python -m squat_gui` pour relier des consignes pratiques de squat à des variables biomécaniques : cinématique, dynamique inverse, CoM, CoP/ZMP, forces de réaction au sol, couples, puissances et ratios d’effort. Il introduit également la notion d’équilibre postural : une même pose basse peut ne plus être acceptable lorsque la morphologie ou la position de la barre change.</w:t>
+        <w:t xml:space="preserve">Ce laboratoire utilise le logiciel </w:t>
+      </w:r>
+      <w:r>
+        <w:rPr>
+          <w:rFonts w:ascii="Aptos Mono" w:hAnsi="Aptos Mono"/>
+          <w:color w:val="1F4D78"/>
+          <w:sz w:val="19"/>
+        </w:rPr>
+        <w:t>Squat_GUI</w:t>
+      </w:r>
+      <w:r>
+        <w:t xml:space="preserve"> et son interface CLI </w:t>
+      </w:r>
+      <w:r>
+        <w:rPr>
+          <w:rFonts w:ascii="Aptos Mono" w:hAnsi="Aptos Mono"/>
+          <w:color w:val="1F4D78"/>
+          <w:sz w:val="19"/>
+        </w:rPr>
+        <w:t>python -m squat_gui</w:t>
+      </w:r>
+      <w:r>
+        <w:t xml:space="preserve"> pour relier des consignes pratiques de squat à des variables biomécaniques : cinématique, dynamique inverse, CoM, CoP/ZMP, forces de réaction au sol, couples, puissances et ratios d’effort. Il introduit également la notion d’équilibre postural : une même pose basse peut ne plus être acceptable lorsque la morphologie ou la position de la barre change.</w:t>
       </w:r>
     </w:p>
     <w:p>
@@ -62,7 +65,12 @@
     </w:p>
     <w:p>
       <w:pPr>
-        <w:pStyle w:val="ListNumber"/>
+        <w:keepNext/>
+        <w:spacing w:after="80" w:line="300" w:lineRule="auto"/>
+        <w:numPr>
+          <w:ilvl w:val="0"/>
+          <w:numId w:val="10"/>
+        </w:numPr>
       </w:pPr>
       <w:r>
         <w:t>expliquer comment la posture modifie la distribution des moments entre hanche, genou et cheville;</w:t>
@@ -70,7 +78,11 @@
     </w:p>
     <w:p>
       <w:pPr>
-        <w:pStyle w:val="ListNumber"/>
+        <w:spacing w:after="80" w:line="300" w:lineRule="auto"/>
+        <w:numPr>
+          <w:ilvl w:val="0"/>
+          <w:numId w:val="10"/>
+        </w:numPr>
       </w:pPr>
       <w:r>
         <w:t>interpréter le CoM, le CoP/ZMP et la zone d’appui fonctionnelle dans une tâche de squat;</w:t>
@@ -78,7 +90,11 @@
     </w:p>
     <w:p>
       <w:pPr>
-        <w:pStyle w:val="ListNumber"/>
+        <w:spacing w:after="80" w:line="300" w:lineRule="auto"/>
+        <w:numPr>
+          <w:ilvl w:val="0"/>
+          <w:numId w:val="10"/>
+        </w:numPr>
       </w:pPr>
       <w:r>
         <w:t>distinguer couple brut et ratio d’effort normalisé par capacité articulaire;</w:t>
@@ -86,7 +102,11 @@
     </w:p>
     <w:p>
       <w:pPr>
-        <w:pStyle w:val="ListNumber"/>
+        <w:spacing w:after="80" w:line="300" w:lineRule="auto"/>
+        <w:numPr>
+          <w:ilvl w:val="0"/>
+          <w:numId w:val="10"/>
+        </w:numPr>
       </w:pPr>
       <w:r>
         <w:t>analyser l’effet de la morphologie et de la position de barre sur l’équilibre, puis proposer une compensation posturale;</w:t>
@@ -94,7 +114,11 @@
     </w:p>
     <w:p>
       <w:pPr>
-        <w:pStyle w:val="ListNumber"/>
+        <w:spacing w:after="80" w:line="300" w:lineRule="auto"/>
+        <w:numPr>
+          <w:ilvl w:val="0"/>
+          <w:numId w:val="10"/>
+        </w:numPr>
       </w:pPr>
       <w:r>
         <w:t>analyser l’effet de la charge, de la vitesse et des longueurs segmentaires;</w:t>
@@ -102,15 +126,45 @@
     </w:p>
     <w:p>
       <w:pPr>
-        <w:pStyle w:val="ListNumber"/>
+        <w:spacing w:after="80" w:line="300" w:lineRule="auto"/>
+        <w:numPr>
+          <w:ilvl w:val="0"/>
+          <w:numId w:val="10"/>
+        </w:numPr>
       </w:pPr>
       <w:r>
-        <w:t>décomposer un moment articulaire en couple total, effet du contact et efforts inertiels/non-linéaires;</w:t>
+        <w:t xml:space="preserve">décomposer un moment articulaire en </w:t>
+      </w:r>
+      <w:r>
+        <w:rPr>
+          <w:rFonts w:ascii="Aptos Mono" w:hAnsi="Aptos Mono"/>
+          <w:color w:val="1F4D78"/>
+          <w:sz w:val="19"/>
+        </w:rPr>
+        <w:t>M(q)q̈</w:t>
+      </w:r>
+      <w:r>
+        <w:t xml:space="preserve">, termes dépendant de </w:t>
+      </w:r>
+      <w:r>
+        <w:rPr>
+          <w:rFonts w:ascii="Aptos Mono" w:hAnsi="Aptos Mono"/>
+          <w:color w:val="1F4D78"/>
+          <w:sz w:val="19"/>
+        </w:rPr>
+        <w:t>q̇</w:t>
+      </w:r>
+      <w:r>
+        <w:t xml:space="preserve"> et gravité, puis distinguer l'effet externe du contact;</w:t>
       </w:r>
     </w:p>
     <w:p>
       <w:pPr>
-        <w:pStyle w:val="ListNumber"/>
+        <w:spacing w:after="80" w:line="300" w:lineRule="auto"/>
+        <w:numPr>
+          <w:ilvl w:val="0"/>
+          <w:numId w:val="10"/>
+        </w:numPr>
       </w:pPr>
       <w:r>
         <w:t>relier les résultats simulés à des résultats expérimentaux publiés;</w:t>
@@ -118,7 +172,11 @@
     </w:p>
     <w:p>
       <w:pPr>
-        <w:pStyle w:val="ListNumber"/>
+        <w:spacing w:after="80" w:line="300" w:lineRule="auto"/>
+        <w:numPr>
+          <w:ilvl w:val="0"/>
+          <w:numId w:val="10"/>
+        </w:numPr>
       </w:pPr>
       <w:r>
         <w:t>formuler une recommandation pratique nuancée plutôt qu’une règle universelle.</w:t>
@@ -134,7 +192,18 @@
     </w:p>
     <w:p>
       <w:r>
-        <w:t>Avant la séance, lire les résumés de littérature dans `docs/references_litterature.md` et répondre aux QCM de préparation.</w:t>
+        <w:t xml:space="preserve">Avant la séance, lire les résumés de littérature dans </w:t>
+      </w:r>
+      <w:r>
+        <w:rPr>
+          <w:rFonts w:ascii="Aptos Mono" w:hAnsi="Aptos Mono"/>
+          <w:color w:val="1F4D78"/>
+          <w:sz w:val="19"/>
+        </w:rPr>
+        <w:t>docs/references_litterature.md</w:t>
+      </w:r>
+      <w:r>
+        <w:t xml:space="preserve"> et répondre aux QCM de préparation.</w:t>
       </w:r>
     </w:p>
     <w:p>
@@ -144,9 +213,16 @@
     </w:p>
     <w:p>
       <w:pPr>
-        <w:pStyle w:val="NoSpacing"/>
+        <w:spacing w:before="60" w:after="160"/>
+        <w:ind w:left="259" w:right="259"/>
+        <w:shd w:fill="F2F4F7"/>
       </w:pPr>
       <w:r>
+        <w:rPr>
+          <w:rFonts w:ascii="Aptos Mono" w:hAnsi="Aptos Mono"/>
+          <w:color w:val="273142"/>
+          <w:sz w:val="17"/>
+        </w:rPr>
         <w:t>python -m squat_gui run --backend biorbd --out exports/condition_demo.csv --summary exports/condition_demo_summary.json</w:t>
       </w:r>
     </w:p>
@@ -157,14 +233,677 @@
     </w:p>
     <w:p>
       <w:pPr>
-        <w:pStyle w:val="NoSpacing"/>
+        <w:spacing w:before="60" w:after="160"/>
+        <w:ind w:left="259" w:right="259"/>
+        <w:shd w:fill="F2F4F7"/>
       </w:pPr>
       <w:r>
+        <w:rPr>
+          <w:rFonts w:ascii="Aptos Mono" w:hAnsi="Aptos Mono"/>
+          <w:color w:val="273142"/>
+          <w:sz w:val="17"/>
+        </w:rPr>
         <w:t>cd Labo</w:t>
         <w:br/>
         <w:t>python scripts/run_squat_batch.py --conditions scenarios/scenarios_labo_squat.csv --out results_labo_squat</w:t>
         <w:br/>
         <w:t>python scripts/analyse_squat_results.py --results results_labo_squat/results.csv --out results_labo_squat/summary_metrics.csv</w:t>
+      </w:r>
+    </w:p>
+    <w:p>
+      <w:pPr>
+        <w:pStyle w:val="Heading1"/>
+      </w:pPr>
+      <w:r>
+        <w:t>Tutoriel de prise en main du GUI</w:t>
+      </w:r>
+    </w:p>
+    <w:p>
+      <w:r>
+        <w:t>Lancer l'interface depuis la racine du projet :</w:t>
+      </w:r>
+    </w:p>
+    <w:p>
+      <w:pPr>
+        <w:spacing w:before="60" w:after="160"/>
+        <w:ind w:left="259" w:right="259"/>
+        <w:shd w:fill="F2F4F7"/>
+      </w:pPr>
+      <w:r>
+        <w:rPr>
+          <w:rFonts w:ascii="Aptos Mono" w:hAnsi="Aptos Mono"/>
+          <w:color w:val="273142"/>
+          <w:sz w:val="17"/>
+        </w:rPr>
+        <w:t>python -m squat_gui</w:t>
+      </w:r>
+    </w:p>
+    <w:p>
+      <w:r>
+        <w:t xml:space="preserve">Le tutoriel intégré suit une progression volontairement graduelle. Les résultats et les alertes restent masqués pendant l'étape </w:t>
+      </w:r>
+      <w:r>
+        <w:rPr>
+          <w:b/>
+        </w:rPr>
+        <w:t>Observation</w:t>
+      </w:r>
+      <w:r>
+        <w:t>, afin de formuler une hypothèse avant de consulter les métriques.</w:t>
+      </w:r>
+    </w:p>
+    <w:p>
+      <w:pPr>
+        <w:pStyle w:val="Heading2"/>
+      </w:pPr>
+      <w:r>
+        <w:t>1. Préparer la condition</w:t>
+      </w:r>
+    </w:p>
+    <w:p>
+      <w:pPr>
+        <w:keepNext/>
+        <w:spacing w:after="80" w:line="300" w:lineRule="auto"/>
+        <w:numPr>
+          <w:ilvl w:val="0"/>
+          <w:numId w:val="11"/>
+        </w:numPr>
+      </w:pPr>
+      <w:r>
+        <w:t>Renseigner le sujet, la position de la barre, la charge et la posture basse.</w:t>
+      </w:r>
+    </w:p>
+    <w:p>
+      <w:pPr>
+        <w:spacing w:after="80" w:line="300" w:lineRule="auto"/>
+        <w:numPr>
+          <w:ilvl w:val="0"/>
+          <w:numId w:val="11"/>
+        </w:numPr>
+      </w:pPr>
+      <w:r>
+        <w:t xml:space="preserve">Pour une variation de longueur, choisir </w:t>
+      </w:r>
+      <w:r>
+        <w:rPr>
+          <w:rFonts w:ascii="Aptos Mono" w:hAnsi="Aptos Mono"/>
+          <w:color w:val="1F4D78"/>
+          <w:sz w:val="19"/>
+        </w:rPr>
+        <w:t>longueur seule</w:t>
+      </w:r>
+      <w:r>
+        <w:t xml:space="preserve"> afin d'isoler la géométrie, ou </w:t>
+      </w:r>
+      <w:r>
+        <w:rPr>
+          <w:rFonts w:ascii="Aptos Mono" w:hAnsi="Aptos Mono"/>
+          <w:color w:val="1F4D78"/>
+          <w:sz w:val="19"/>
+        </w:rPr>
+        <w:t>morphotype recalibre</w:t>
+      </w:r>
+      <w:r>
+        <w:t xml:space="preserve"> pour appliquer la sensibilité didactique documentée aux masses et inerties.</w:t>
+      </w:r>
+    </w:p>
+    <w:p>
+      <w:pPr>
+        <w:spacing w:after="80" w:line="300" w:lineRule="auto"/>
+        <w:numPr>
+          <w:ilvl w:val="0"/>
+          <w:numId w:val="11"/>
+        </w:numPr>
+      </w:pPr>
+      <w:r>
+        <w:t xml:space="preserve">Choisir un profil temporel : </w:t>
+      </w:r>
+      <w:r>
+        <w:rPr>
+          <w:rFonts w:ascii="Aptos Mono" w:hAnsi="Aptos Mono"/>
+          <w:color w:val="1F4D78"/>
+          <w:sz w:val="19"/>
+        </w:rPr>
+        <w:t>Référence 4/2/4</w:t>
+      </w:r>
+      <w:r>
+        <w:t xml:space="preserve">, </w:t>
+      </w:r>
+      <w:r>
+        <w:rPr>
+          <w:rFonts w:ascii="Aptos Mono" w:hAnsi="Aptos Mono"/>
+          <w:color w:val="1F4D78"/>
+          <w:sz w:val="19"/>
+        </w:rPr>
+        <w:t>Lent 6/2/6</w:t>
+      </w:r>
+      <w:r>
+        <w:t xml:space="preserve">, </w:t>
+      </w:r>
+      <w:r>
+        <w:rPr>
+          <w:rFonts w:ascii="Aptos Mono" w:hAnsi="Aptos Mono"/>
+          <w:color w:val="1F4D78"/>
+          <w:sz w:val="19"/>
+        </w:rPr>
+        <w:t>Rapide 2/0,5/2</w:t>
+      </w:r>
+      <w:r>
+        <w:t xml:space="preserve">, </w:t>
+      </w:r>
+      <w:r>
+        <w:rPr>
+          <w:rFonts w:ascii="Aptos Mono" w:hAnsi="Aptos Mono"/>
+          <w:color w:val="1F4D78"/>
+          <w:sz w:val="19"/>
+        </w:rPr>
+        <w:t>Sans pause 4/0/4</w:t>
+      </w:r>
+      <w:r>
+        <w:t xml:space="preserve">, </w:t>
+      </w:r>
+      <w:r>
+        <w:rPr>
+          <w:rFonts w:ascii="Aptos Mono" w:hAnsi="Aptos Mono"/>
+          <w:color w:val="1F4D78"/>
+          <w:sz w:val="19"/>
+        </w:rPr>
+        <w:t>Descente lente / montée rapide 6/1/2</w:t>
+      </w:r>
+      <w:r>
+        <w:t xml:space="preserve"> ou </w:t>
+      </w:r>
+      <w:r>
+        <w:rPr>
+          <w:rFonts w:ascii="Aptos Mono" w:hAnsi="Aptos Mono"/>
+          <w:color w:val="1F4D78"/>
+          <w:sz w:val="19"/>
+        </w:rPr>
+        <w:t>Descente rapide / montée lente 2/1/6</w:t>
+      </w:r>
+      <w:r>
+        <w:t>.</w:t>
+      </w:r>
+    </w:p>
+    <w:p>
+      <w:pPr>
+        <w:spacing w:after="80" w:line="300" w:lineRule="auto"/>
+        <w:numPr>
+          <w:ilvl w:val="0"/>
+          <w:numId w:val="11"/>
+        </w:numPr>
+      </w:pPr>
+      <w:r>
+        <w:t xml:space="preserve">Vérifier les durées de descente, de pause et de remontée. Le pas temporel est fixé à </w:t>
+      </w:r>
+      <w:r>
+        <w:rPr>
+          <w:rFonts w:ascii="Aptos Mono" w:hAnsi="Aptos Mono"/>
+          <w:color w:val="1F4D78"/>
+          <w:sz w:val="19"/>
+        </w:rPr>
+        <w:t>Δt = 0,05 s</w:t>
+      </w:r>
+      <w:r>
+        <w:t xml:space="preserve">; une modification manuelle des durées active le profil </w:t>
+      </w:r>
+      <w:r>
+        <w:rPr>
+          <w:rFonts w:ascii="Aptos Mono" w:hAnsi="Aptos Mono"/>
+          <w:color w:val="1F4D78"/>
+          <w:sz w:val="19"/>
+        </w:rPr>
+        <w:t>Personnalisé</w:t>
+      </w:r>
+      <w:r>
+        <w:t>.</w:t>
+      </w:r>
+    </w:p>
+    <w:p>
+      <w:pPr>
+        <w:spacing w:after="80" w:line="300" w:lineRule="auto"/>
+        <w:numPr>
+          <w:ilvl w:val="0"/>
+          <w:numId w:val="11"/>
+        </w:numPr>
+      </w:pPr>
+      <w:r>
+        <w:t>Lancer la simulation, puis démarrer l'animation.</w:t>
+      </w:r>
+    </w:p>
+    <w:p>
+      <w:pPr>
+        <w:pStyle w:val="Heading2"/>
+      </w:pPr>
+      <w:r>
+        <w:t>2. Observer avant de mesurer</w:t>
+      </w:r>
+    </w:p>
+    <w:p>
+      <w:r>
+        <w:t xml:space="preserve">Pendant </w:t>
+      </w:r>
+      <w:r>
+        <w:rPr>
+          <w:b/>
+        </w:rPr>
+        <w:t>Observation</w:t>
+      </w:r>
+      <w:r>
+        <w:t>, décrire qualitativement la stratégie : déplacement du tronc et du bassin, progression des genoux, position apparente du centre de masse et phase qui semble la plus exigeante. Noter une prédiction sur l'articulation limitante et sur le risque de sortie de la zone d'appui.</w:t>
+      </w:r>
+    </w:p>
+    <w:p>
+      <w:pPr>
+        <w:pStyle w:val="Heading2"/>
+      </w:pPr>
+      <w:r>
+        <w:t>3. Examiner la cinématique</w:t>
+      </w:r>
+    </w:p>
+    <w:p>
+      <w:r>
+        <w:t xml:space="preserve">Passer à </w:t>
+      </w:r>
+      <w:r>
+        <w:rPr>
+          <w:b/>
+        </w:rPr>
+        <w:t>Cinématique</w:t>
+      </w:r>
+      <w:r>
+        <w:t xml:space="preserve">, puis utiliser le menu </w:t>
+      </w:r>
+      <w:r>
+        <w:rPr>
+          <w:rFonts w:ascii="Aptos Mono" w:hAnsi="Aptos Mono"/>
+          <w:color w:val="1F4D78"/>
+          <w:sz w:val="19"/>
+        </w:rPr>
+        <w:t>Affichage</w:t>
+      </w:r>
+      <w:r>
+        <w:t xml:space="preserve"> pour choisir les couches visibles : articulations, centre de masse global ou segmentaire, angles segmentaires et coordonnées articulaires. Survoler une articulation dans l'animation pour afficher ses coordonnées dans une infobulle.</w:t>
+      </w:r>
+    </w:p>
+    <w:p>
+      <w:r>
+        <w:t>Dans la vue synchronisée :</w:t>
+      </w:r>
+    </w:p>
+    <w:p>
+      <w:pPr>
+        <w:keepNext/>
+        <w:spacing w:after="80" w:line="300" w:lineRule="auto"/>
+        <w:numPr>
+          <w:ilvl w:val="0"/>
+          <w:numId w:val="12"/>
+        </w:numPr>
+      </w:pPr>
+      <w:r>
+        <w:t>choisir une articulation ou le CoM comme source;</w:t>
+      </w:r>
+    </w:p>
+    <w:p>
+      <w:pPr>
+        <w:spacing w:after="80" w:line="300" w:lineRule="auto"/>
+        <w:numPr>
+          <w:ilvl w:val="0"/>
+          <w:numId w:val="12"/>
+        </w:numPr>
+      </w:pPr>
+      <w:r>
+        <w:t>comparer position, vitesse et accélération sur les trois graphiques alignés;</w:t>
+      </w:r>
+    </w:p>
+    <w:p>
+      <w:pPr>
+        <w:spacing w:after="80" w:line="300" w:lineRule="auto"/>
+        <w:numPr>
+          <w:ilvl w:val="0"/>
+          <w:numId w:val="12"/>
+        </w:numPr>
+      </w:pPr>
+      <w:r>
+        <w:t>cliquer ou faire glisser le curseur vertical pour déplacer simultanément l'animation et les trois graphiques;</w:t>
+      </w:r>
+    </w:p>
+    <w:p>
+      <w:pPr>
+        <w:spacing w:after="80" w:line="300" w:lineRule="auto"/>
+        <w:numPr>
+          <w:ilvl w:val="0"/>
+          <w:numId w:val="12"/>
+        </w:numPr>
+      </w:pPr>
+      <w:r>
+        <w:t>ouvrir l'inspecteur numérique pour lire les valeurs exactes de la frame courante;</w:t>
+      </w:r>
+    </w:p>
+    <w:p>
+      <w:pPr>
+        <w:spacing w:after="80" w:line="300" w:lineRule="auto"/>
+        <w:numPr>
+          <w:ilvl w:val="0"/>
+          <w:numId w:val="12"/>
+        </w:numPr>
+      </w:pPr>
+      <w:r>
+        <w:t>masquer indépendamment les noms de phases ou leurs limites si elles gênent la lecture.</w:t>
+      </w:r>
+    </w:p>
+    <w:p>
+      <w:pPr>
+        <w:spacing w:after="80" w:line="300" w:lineRule="auto"/>
+        <w:numPr>
+          <w:ilvl w:val="0"/>
+          <w:numId w:val="12"/>
+        </w:numPr>
+      </w:pPr>
+      <w:r>
+        <w:t xml:space="preserve">choisir le repère </w:t>
+      </w:r>
+      <w:r>
+        <w:rPr>
+          <w:rFonts w:ascii="Aptos Mono" w:hAnsi="Aptos Mono"/>
+          <w:color w:val="1F4D78"/>
+          <w:sz w:val="19"/>
+        </w:rPr>
+        <w:t>absolu</w:t>
+      </w:r>
+      <w:r>
+        <w:t xml:space="preserve">, </w:t>
+      </w:r>
+      <w:r>
+        <w:rPr>
+          <w:rFonts w:ascii="Aptos Mono" w:hAnsi="Aptos Mono"/>
+          <w:color w:val="1F4D78"/>
+          <w:sz w:val="19"/>
+        </w:rPr>
+        <w:t>centré</w:t>
+      </w:r>
+      <w:r>
+        <w:t xml:space="preserve"> ou </w:t>
+      </w:r>
+      <w:r>
+        <w:rPr>
+          <w:rFonts w:ascii="Aptos Mono" w:hAnsi="Aptos Mono"/>
+          <w:color w:val="1F4D78"/>
+          <w:sz w:val="19"/>
+        </w:rPr>
+        <w:t>normalisé</w:t>
+      </w:r>
+      <w:r>
+        <w:t>; en mode normalisé, tenir compte de l'avertissement indiquant que les différences de durée sont masquées.</w:t>
+      </w:r>
+    </w:p>
+    <w:p>
+      <w:pPr>
+        <w:pStyle w:val="Heading2"/>
+      </w:pPr>
+      <w:r>
+        <w:t>4. Examiner la dynamique</w:t>
+      </w:r>
+    </w:p>
+    <w:p>
+      <w:r>
+        <w:t xml:space="preserve">Passer à </w:t>
+      </w:r>
+      <w:r>
+        <w:rPr>
+          <w:b/>
+        </w:rPr>
+        <w:t>Dynamique</w:t>
+      </w:r>
+      <w:r>
+        <w:t xml:space="preserve"> et comparer les forces de réaction au sol, le CoP/ZMP, les couples articulaires, les puissances et l'utilisation demande/capacité </w:t>
+      </w:r>
+      <w:r>
+        <w:rPr>
+          <w:rFonts w:ascii="Aptos Mono" w:hAnsi="Aptos Mono"/>
+          <w:color w:val="1F4D78"/>
+          <w:sz w:val="19"/>
+        </w:rPr>
+        <w:t>U</w:t>
+      </w:r>
+      <w:r>
+        <w:t xml:space="preserve">. Les contrôles </w:t>
+      </w:r>
+      <w:r>
+        <w:rPr>
+          <w:rFonts w:ascii="Aptos Mono" w:hAnsi="Aptos Mono"/>
+          <w:color w:val="1F4D78"/>
+          <w:sz w:val="19"/>
+        </w:rPr>
+        <w:t>max-angle (Anderson)</w:t>
+      </w:r>
+      <w:r>
+        <w:t xml:space="preserve"> et </w:t>
+      </w:r>
+      <w:r>
+        <w:rPr>
+          <w:rFonts w:ascii="Aptos Mono" w:hAnsi="Aptos Mono"/>
+          <w:color w:val="1F4D78"/>
+          <w:sz w:val="19"/>
+        </w:rPr>
+        <w:t>max-vitesse (Anderson)</w:t>
+      </w:r>
+      <w:r>
+        <w:t xml:space="preserve"> modulent séparément la capacité active. Le régime est cohérent avec la puissance affichée : puissance positive en concentrique/génération, négative en excentrique/absorption et vitesse nulle en isométrique. Dans </w:t>
+      </w:r>
+      <w:r>
+        <w:rPr>
+          <w:rFonts w:ascii="Aptos Mono" w:hAnsi="Aptos Mono"/>
+          <w:color w:val="1F4D78"/>
+          <w:sz w:val="19"/>
+        </w:rPr>
+        <w:t>couples détaillés</w:t>
+      </w:r>
+      <w:r>
+        <w:t xml:space="preserve">, utiliser </w:t>
+      </w:r>
+      <w:r>
+        <w:rPr>
+          <w:rFonts w:ascii="Aptos Mono" w:hAnsi="Aptos Mono"/>
+          <w:color w:val="1F4D78"/>
+          <w:sz w:val="19"/>
+        </w:rPr>
+        <w:t>Affichage</w:t>
+      </w:r>
+      <w:r>
+        <w:t xml:space="preserve"> pour masquer ou afficher séparément </w:t>
+      </w:r>
+      <w:r>
+        <w:rPr>
+          <w:rFonts w:ascii="Aptos Mono" w:hAnsi="Aptos Mono"/>
+          <w:color w:val="1F4D78"/>
+          <w:sz w:val="19"/>
+        </w:rPr>
+        <w:t>M(q)q̈</w:t>
+      </w:r>
+      <w:r>
+        <w:t xml:space="preserve">, les termes dépendant de </w:t>
+      </w:r>
+      <w:r>
+        <w:rPr>
+          <w:rFonts w:ascii="Aptos Mono" w:hAnsi="Aptos Mono"/>
+          <w:color w:val="1F4D78"/>
+          <w:sz w:val="19"/>
+        </w:rPr>
+        <w:t>q̇</w:t>
+      </w:r>
+      <w:r>
+        <w:t xml:space="preserve">, la gravité, le contact externe signé et le </w:t>
+      </w:r>
+      <w:r>
+        <w:rPr>
+          <w:rFonts w:ascii="Aptos Mono" w:hAnsi="Aptos Mono"/>
+          <w:color w:val="1F4D78"/>
+          <w:sz w:val="19"/>
+        </w:rPr>
+        <w:t>total ID</w:t>
+      </w:r>
+      <w:r>
+        <w:t>.</w:t>
+      </w:r>
+    </w:p>
+    <w:p>
+      <w:r>
+        <w:t xml:space="preserve">Interpréter </w:t>
+      </w:r>
+      <w:r>
+        <w:rPr>
+          <w:rFonts w:ascii="Aptos Mono" w:hAnsi="Aptos Mono"/>
+          <w:color w:val="1F4D78"/>
+          <w:sz w:val="19"/>
+        </w:rPr>
+        <w:t>U = |couple requis| / capacité active disponible</w:t>
+      </w:r>
+      <w:r>
+        <w:t xml:space="preserve"> comme une </w:t>
+      </w:r>
+      <w:r>
+        <w:rPr>
+          <w:b/>
+        </w:rPr>
+        <w:t>faisabilité mécanique dans les hypothèses du modèle</w:t>
+      </w:r>
+      <w:r>
+        <w:t xml:space="preserve">. </w:t>
+      </w:r>
+      <w:r>
+        <w:rPr>
+          <w:rFonts w:ascii="Aptos Mono" w:hAnsi="Aptos Mono"/>
+          <w:color w:val="1F4D78"/>
+          <w:sz w:val="19"/>
+        </w:rPr>
+        <w:t>U &gt; 1</w:t>
+      </w:r>
+      <w:r>
+        <w:t xml:space="preserve"> signale une demande supérieure à cette capacité modélisée, mais ne constitue pas un verdict absolu sur la réussite d'une personne. Le tableau des conditions donne </w:t>
+      </w:r>
+      <w:r>
+        <w:rPr>
+          <w:rFonts w:ascii="Aptos Mono" w:hAnsi="Aptos Mono"/>
+          <w:color w:val="1F4D78"/>
+          <w:sz w:val="19"/>
+        </w:rPr>
+        <w:t>U max</w:t>
+      </w:r>
+      <w:r>
+        <w:t>, l'articulation limitante, le temps, la phase et le dépassement éventuel.</w:t>
+      </w:r>
+    </w:p>
+    <w:p>
+      <w:r>
+        <w:t xml:space="preserve">Dans ce modèle à pied fixé, vérifier la reconstruction </w:t>
+      </w:r>
+      <w:r>
+        <w:rPr>
+          <w:rFonts w:ascii="Aptos Mono" w:hAnsi="Aptos Mono"/>
+          <w:color w:val="1F4D78"/>
+          <w:sz w:val="19"/>
+        </w:rPr>
+        <w:t>total ID = M(q)q̈ + termes q̇ + gravité</w:t>
+      </w:r>
+      <w:r>
+        <w:t>. Le contact est présenté séparément : il ne doit pas être ajouté une seconde fois au total contraint. Revenir ensuite à l'hypothèse formulée en Observation et préciser ce qui est confirmé, infirmé ou reste ambigu.</w:t>
+      </w:r>
+    </w:p>
+    <w:p>
+      <w:pPr>
+        <w:pStyle w:val="Heading2"/>
+      </w:pPr>
+      <w:r>
+        <w:t>5. Comparer en contrôlant les variables</w:t>
+      </w:r>
+    </w:p>
+    <w:p>
+      <w:r>
+        <w:t xml:space="preserve">Enregistrer d'abord une condition de référence. La sélectionner, cliquer sur </w:t>
+      </w:r>
+      <w:r>
+        <w:rPr>
+          <w:rFonts w:ascii="Aptos Mono" w:hAnsi="Aptos Mono"/>
+          <w:color w:val="1F4D78"/>
+          <w:sz w:val="19"/>
+        </w:rPr>
+        <w:t>Dupliquer</w:t>
+      </w:r>
+      <w:r>
+        <w:t xml:space="preserve">, modifier un seul paramètre scientifique, puis cliquer sur </w:t>
+      </w:r>
+      <w:r>
+        <w:rPr>
+          <w:rFonts w:ascii="Aptos Mono" w:hAnsi="Aptos Mono"/>
+          <w:color w:val="1F4D78"/>
+          <w:sz w:val="19"/>
+        </w:rPr>
+        <w:t>Ajouter</w:t>
+      </w:r>
+      <w:r>
+        <w:t xml:space="preserve">. Sélectionner ensuite les deux conditions et ouvrir l'onglet </w:t>
+      </w:r>
+      <w:r>
+        <w:rPr>
+          <w:rFonts w:ascii="Aptos Mono" w:hAnsi="Aptos Mono"/>
+          <w:color w:val="1F4D78"/>
+          <w:sz w:val="19"/>
+        </w:rPr>
+        <w:t>Variables contrôlées</w:t>
+      </w:r>
+      <w:r>
+        <w:t xml:space="preserve"> : il doit nommer le paramètre modifié et présenter les valeurs de référence et comparée avec leurs unités. Les différences de simple affichage ne sont pas comptées.</w:t>
+      </w:r>
+    </w:p>
+    <w:p>
+      <w:r>
+        <w:t xml:space="preserve">Le menu </w:t>
+      </w:r>
+      <w:r>
+        <w:rPr>
+          <w:rFonts w:ascii="Aptos Mono" w:hAnsi="Aptos Mono"/>
+          <w:color w:val="1F4D78"/>
+          <w:sz w:val="19"/>
+        </w:rPr>
+        <w:t>Affichage</w:t>
+      </w:r>
+      <w:r>
+        <w:t xml:space="preserve"> centralise les courbes, composantes, axes, limites et couches de l'animation. Changer une couche modifie uniquement le rendu et ne relance pas la simulation.</w:t>
+      </w:r>
+    </w:p>
+    <w:p>
+      <w:r>
+        <w:t xml:space="preserve">Lors d'une comparaison morphologique, vérifier dans la couche </w:t>
+      </w:r>
+      <w:r>
+        <w:rPr>
+          <w:rFonts w:ascii="Aptos Mono" w:hAnsi="Aptos Mono"/>
+          <w:color w:val="1F4D78"/>
+          <w:sz w:val="19"/>
+        </w:rPr>
+        <w:t>Anthropométrie utilisée</w:t>
+      </w:r>
+      <w:r>
+        <w:t xml:space="preserve"> que le mode est identique entre conditions, sauf si le mode lui-même constitue la variable étudiée. Les trois prises de barre modifient la géométrie et la dynamique, mais la barre est modélisée comme un point massique sans longueur ni inertie propre.</w:t>
+      </w:r>
+    </w:p>
+    <w:p>
+      <w:pPr>
+        <w:pStyle w:val="Heading2"/>
+      </w:pPr>
+      <w:r>
+        <w:t>6. Conserver une trace reproductible</w:t>
+      </w:r>
+    </w:p>
+    <w:p>
+      <w:r>
+        <w:t>Enregistrer la condition lorsqu'elle doit être réutilisée. Pour une analyse complète, exporter le classeur Excel : chaque famille de métriques est placée dans un onglet dédié et la table anthropométrique effectivement utilisée est incluse. L'export vidéo MP4 permet de conserver l'animation et les couches d'affichage sélectionnées.</w:t>
+      </w:r>
+    </w:p>
+    <w:p>
+      <w:r>
+        <w:t>Avant de poursuivre, vérifier que vous savez : sélectionner un preset temporel, afficher une coordonnée par survol, déplacer le curseur synchronisé, lire l'inspecteur numérique, distinguer les trois repères temporels, dupliquer une référence, vérifier les variables contrôlées et produire un export.</w:t>
       </w:r>
     </w:p>
     <w:p>
@@ -185,7 +924,7 @@
     </w:p>
     <w:p>
       <w:r>
-        <w:t>Lancer une simulation baseline. Identifier les angles articulaires, les vitesses, les accélérations, les moments, les puissances, le CoM, le CoP/ZMP et les ratios d’effort.</w:t>
+        <w:t>Lancer une simulation baseline en suivant le tutoriel intégré. Formuler d'abord une hypothèse en mode Observation, puis identifier les angles articulaires, les vitesses, les accélérations, les moments, les puissances, le CoM, le CoP/ZMP et les ratios d'effort.</w:t>
       </w:r>
     </w:p>
     <w:p>
@@ -195,7 +934,12 @@
     </w:p>
     <w:p>
       <w:pPr>
-        <w:pStyle w:val="ListBullet"/>
+        <w:keepNext/>
+        <w:spacing w:after="80" w:line="300" w:lineRule="auto"/>
+        <w:numPr>
+          <w:ilvl w:val="0"/>
+          <w:numId w:val="13"/>
+        </w:numPr>
       </w:pPr>
       <w:r>
         <w:t>Le pic de couple au genou survient-il au point bas ou pendant la remontée?</w:t>
@@ -203,7 +947,11 @@
     </w:p>
     <w:p>
       <w:pPr>
-        <w:pStyle w:val="ListBullet"/>
+        <w:spacing w:after="80" w:line="300" w:lineRule="auto"/>
+        <w:numPr>
+          <w:ilvl w:val="0"/>
+          <w:numId w:val="13"/>
+        </w:numPr>
       </w:pPr>
       <w:r>
         <w:t>Le ZMP reste-t-il dans la zone d’appui fonctionnelle?</w:t>
@@ -211,7 +959,11 @@
     </w:p>
     <w:p>
       <w:pPr>
-        <w:pStyle w:val="ListBullet"/>
+        <w:spacing w:after="80" w:line="300" w:lineRule="auto"/>
+        <w:numPr>
+          <w:ilvl w:val="0"/>
+          <w:numId w:val="13"/>
+        </w:numPr>
       </w:pPr>
       <w:r>
         <w:t>Quelle articulation a le ratio d’effort le plus élevé?</w:t>
@@ -227,7 +979,29 @@
     </w:p>
     <w:p>
       <w:r>
-        <w:t>Comparer `posture_knee_dominant` et `posture_hip_dominant`.</w:t>
+        <w:t xml:space="preserve">Comparer </w:t>
+      </w:r>
+      <w:r>
+        <w:rPr>
+          <w:rFonts w:ascii="Aptos Mono" w:hAnsi="Aptos Mono"/>
+          <w:color w:val="1F4D78"/>
+          <w:sz w:val="19"/>
+        </w:rPr>
+        <w:t>posture_knee_dominant</w:t>
+      </w:r>
+      <w:r>
+        <w:t xml:space="preserve"> et </w:t>
+      </w:r>
+      <w:r>
+        <w:rPr>
+          <w:rFonts w:ascii="Aptos Mono" w:hAnsi="Aptos Mono"/>
+          <w:color w:val="1F4D78"/>
+          <w:sz w:val="19"/>
+        </w:rPr>
+        <w:t>posture_hip_dominant</w:t>
+      </w:r>
+      <w:r>
+        <w:t>.</w:t>
       </w:r>
     </w:p>
     <w:p>
@@ -265,26 +1039,107 @@
     </w:p>
     <w:p>
       <w:pPr>
-        <w:pStyle w:val="ListBullet"/>
+        <w:keepNext/>
+        <w:spacing w:after="80" w:line="300" w:lineRule="auto"/>
+        <w:numPr>
+          <w:ilvl w:val="0"/>
+          <w:numId w:val="14"/>
+        </w:numPr>
       </w:pPr>
       <w:r>
-        <w:t>`balance_bar_back`, `balance_bar_front` et `balance_bar_overhead`;</w:t>
+        <w:rPr>
+          <w:rFonts w:ascii="Aptos Mono" w:hAnsi="Aptos Mono"/>
+          <w:color w:val="1F4D78"/>
+          <w:sz w:val="19"/>
+        </w:rPr>
+        <w:t>balance_bar_back</w:t>
+      </w:r>
+      <w:r>
+        <w:t xml:space="preserve">, </w:t>
+      </w:r>
+      <w:r>
+        <w:rPr>
+          <w:rFonts w:ascii="Aptos Mono" w:hAnsi="Aptos Mono"/>
+          <w:color w:val="1F4D78"/>
+          <w:sz w:val="19"/>
+        </w:rPr>
+        <w:t>balance_bar_front</w:t>
+      </w:r>
+      <w:r>
+        <w:t xml:space="preserve"> et </w:t>
+      </w:r>
+      <w:r>
+        <w:rPr>
+          <w:rFonts w:ascii="Aptos Mono" w:hAnsi="Aptos Mono"/>
+          <w:color w:val="1F4D78"/>
+          <w:sz w:val="19"/>
+        </w:rPr>
+        <w:t>balance_bar_overhead</w:t>
+      </w:r>
+      <w:r>
+        <w:t>;</w:t>
       </w:r>
     </w:p>
     <w:p>
       <w:pPr>
-        <w:pStyle w:val="ListBullet"/>
+        <w:spacing w:after="80" w:line="300" w:lineRule="auto"/>
+        <w:numPr>
+          <w:ilvl w:val="0"/>
+          <w:numId w:val="14"/>
+        </w:numPr>
       </w:pPr>
       <w:r>
-        <w:t>`balance_long_thigh_back` et `balance_long_thigh_front`;</w:t>
+        <w:rPr>
+          <w:rFonts w:ascii="Aptos Mono" w:hAnsi="Aptos Mono"/>
+          <w:color w:val="1F4D78"/>
+          <w:sz w:val="19"/>
+        </w:rPr>
+        <w:t>balance_long_thigh_back</w:t>
+      </w:r>
+      <w:r>
+        <w:t xml:space="preserve"> et </w:t>
+      </w:r>
+      <w:r>
+        <w:rPr>
+          <w:rFonts w:ascii="Aptos Mono" w:hAnsi="Aptos Mono"/>
+          <w:color w:val="1F4D78"/>
+          <w:sz w:val="19"/>
+        </w:rPr>
+        <w:t>balance_long_thigh_front</w:t>
+      </w:r>
+      <w:r>
+        <w:t>;</w:t>
       </w:r>
     </w:p>
     <w:p>
       <w:pPr>
-        <w:pStyle w:val="ListBullet"/>
+        <w:spacing w:after="80" w:line="300" w:lineRule="auto"/>
+        <w:numPr>
+          <w:ilvl w:val="0"/>
+          <w:numId w:val="14"/>
+        </w:numPr>
       </w:pPr>
       <w:r>
-        <w:t>`balance_pregnant_back` et `balance_pregnant_front`.</w:t>
+        <w:rPr>
+          <w:rFonts w:ascii="Aptos Mono" w:hAnsi="Aptos Mono"/>
+          <w:color w:val="1F4D78"/>
+          <w:sz w:val="19"/>
+        </w:rPr>
+        <w:t>balance_pregnant_back</w:t>
+      </w:r>
+      <w:r>
+        <w:t xml:space="preserve"> et </w:t>
+      </w:r>
+      <w:r>
+        <w:rPr>
+          <w:rFonts w:ascii="Aptos Mono" w:hAnsi="Aptos Mono"/>
+          <w:color w:val="1F4D78"/>
+          <w:sz w:val="19"/>
+        </w:rPr>
+        <w:t>balance_pregnant_front</w:t>
+      </w:r>
+      <w:r>
+        <w:t>.</w:t>
       </w:r>
     </w:p>
     <w:p>
@@ -294,7 +1149,12 @@
     </w:p>
     <w:p>
       <w:pPr>
-        <w:pStyle w:val="ListBullet"/>
+        <w:keepNext/>
+        <w:spacing w:after="80" w:line="300" w:lineRule="auto"/>
+        <w:numPr>
+          <w:ilvl w:val="0"/>
+          <w:numId w:val="15"/>
+        </w:numPr>
       </w:pPr>
       <w:r>
         <w:t>À pose identique, comment la prise de barre déplace-t-elle le CoM au point bas et le CoP/ZMP pendant le mouvement?</w:t>
@@ -302,15 +1162,34 @@
     </w:p>
     <w:p>
       <w:pPr>
-        <w:pStyle w:val="ListBullet"/>
+        <w:spacing w:after="80" w:line="300" w:lineRule="auto"/>
+        <w:numPr>
+          <w:ilvl w:val="0"/>
+          <w:numId w:val="15"/>
+        </w:numPr>
       </w:pPr>
       <w:r>
-        <w:t>Une cuisse plus longue ou le profil `femme enceinte` rend-il la même stratégie posturale plus difficile à équilibrer?</w:t>
+        <w:t xml:space="preserve">Une cuisse plus longue ou le profil </w:t>
+      </w:r>
+      <w:r>
+        <w:rPr>
+          <w:rFonts w:ascii="Aptos Mono" w:hAnsi="Aptos Mono"/>
+          <w:color w:val="1F4D78"/>
+          <w:sz w:val="19"/>
+        </w:rPr>
+        <w:t>femme enceinte</w:t>
+      </w:r>
+      <w:r>
+        <w:t xml:space="preserve"> rend-il la même stratégie posturale plus difficile à équilibrer?</w:t>
       </w:r>
     </w:p>
     <w:p>
       <w:pPr>
-        <w:pStyle w:val="ListBullet"/>
+        <w:spacing w:after="80" w:line="300" w:lineRule="auto"/>
+        <w:numPr>
+          <w:ilvl w:val="0"/>
+          <w:numId w:val="15"/>
+        </w:numPr>
       </w:pPr>
       <w:r>
         <w:t>Dans quels cas le ZMP sort-il de la zone d’appui, et pendant combien de frames?</w:t>
@@ -318,7 +1197,11 @@
     </w:p>
     <w:p>
       <w:pPr>
-        <w:pStyle w:val="ListBullet"/>
+        <w:spacing w:after="80" w:line="300" w:lineRule="auto"/>
+        <w:numPr>
+          <w:ilvl w:val="0"/>
+          <w:numId w:val="15"/>
+        </w:numPr>
       </w:pPr>
       <w:r>
         <w:t>La prise qui améliore l’équilibre réduit-elle nécessairement le ratio d’effort de toutes les articulations?</w:t>
@@ -331,7 +1214,40 @@
     </w:p>
     <w:p>
       <w:r>
-        <w:t>Variables à extraire : `squat_com_x_m`, `squat_cop_x_m`, `zmp_outside_support_frames`, excursion du ZMP, pics de couples et ratios d’effort.</w:t>
+        <w:t xml:space="preserve">Variables à extraire : </w:t>
+      </w:r>
+      <w:r>
+        <w:rPr>
+          <w:rFonts w:ascii="Aptos Mono" w:hAnsi="Aptos Mono"/>
+          <w:color w:val="1F4D78"/>
+          <w:sz w:val="19"/>
+        </w:rPr>
+        <w:t>squat_com_x_m</w:t>
+      </w:r>
+      <w:r>
+        <w:t xml:space="preserve">, </w:t>
+      </w:r>
+      <w:r>
+        <w:rPr>
+          <w:rFonts w:ascii="Aptos Mono" w:hAnsi="Aptos Mono"/>
+          <w:color w:val="1F4D78"/>
+          <w:sz w:val="19"/>
+        </w:rPr>
+        <w:t>squat_support_point_x_m</w:t>
+      </w:r>
+      <w:r>
+        <w:t xml:space="preserve">, </w:t>
+      </w:r>
+      <w:r>
+        <w:rPr>
+          <w:rFonts w:ascii="Aptos Mono" w:hAnsi="Aptos Mono"/>
+          <w:color w:val="1F4D78"/>
+          <w:sz w:val="19"/>
+        </w:rPr>
+        <w:t>zmp_outside_support_frames</w:t>
+      </w:r>
+      <w:r>
+        <w:t>, excursion du point d’appui, pics de couples et ratios d’effort.</w:t>
       </w:r>
     </w:p>
     <w:p>
@@ -349,7 +1265,29 @@
     </w:p>
     <w:p>
       <w:r>
-        <w:t>Comparer `stability_forward` et `stability_backward`.</w:t>
+        <w:t xml:space="preserve">Comparer </w:t>
+      </w:r>
+      <w:r>
+        <w:rPr>
+          <w:rFonts w:ascii="Aptos Mono" w:hAnsi="Aptos Mono"/>
+          <w:color w:val="1F4D78"/>
+          <w:sz w:val="19"/>
+        </w:rPr>
+        <w:t>stability_forward</w:t>
+      </w:r>
+      <w:r>
+        <w:t xml:space="preserve"> et </w:t>
+      </w:r>
+      <w:r>
+        <w:rPr>
+          <w:rFonts w:ascii="Aptos Mono" w:hAnsi="Aptos Mono"/>
+          <w:color w:val="1F4D78"/>
+          <w:sz w:val="19"/>
+        </w:rPr>
+        <w:t>stability_backward</w:t>
+      </w:r>
+      <w:r>
+        <w:t>.</w:t>
       </w:r>
     </w:p>
     <w:p>
@@ -377,7 +1315,51 @@
     </w:p>
     <w:p>
       <w:r>
-        <w:t>Comparer `baseline`, `load_30bw`, `load_60bw` et `load_100bw`. La charge de barre est exprimée en pourcentage du poids de corps du sujet de référence de 70 kg.</w:t>
+        <w:t xml:space="preserve">Comparer </w:t>
+      </w:r>
+      <w:r>
+        <w:rPr>
+          <w:rFonts w:ascii="Aptos Mono" w:hAnsi="Aptos Mono"/>
+          <w:color w:val="1F4D78"/>
+          <w:sz w:val="19"/>
+        </w:rPr>
+        <w:t>baseline</w:t>
+      </w:r>
+      <w:r>
+        <w:t xml:space="preserve">, </w:t>
+      </w:r>
+      <w:r>
+        <w:rPr>
+          <w:rFonts w:ascii="Aptos Mono" w:hAnsi="Aptos Mono"/>
+          <w:color w:val="1F4D78"/>
+          <w:sz w:val="19"/>
+        </w:rPr>
+        <w:t>load_30bw</w:t>
+      </w:r>
+      <w:r>
+        <w:t xml:space="preserve">, </w:t>
+      </w:r>
+      <w:r>
+        <w:rPr>
+          <w:rFonts w:ascii="Aptos Mono" w:hAnsi="Aptos Mono"/>
+          <w:color w:val="1F4D78"/>
+          <w:sz w:val="19"/>
+        </w:rPr>
+        <w:t>load_60bw</w:t>
+      </w:r>
+      <w:r>
+        <w:t xml:space="preserve"> et </w:t>
+      </w:r>
+      <w:r>
+        <w:rPr>
+          <w:rFonts w:ascii="Aptos Mono" w:hAnsi="Aptos Mono"/>
+          <w:color w:val="1F4D78"/>
+          <w:sz w:val="19"/>
+        </w:rPr>
+        <w:t>load_100bw</w:t>
+      </w:r>
+      <w:r>
+        <w:t>. La charge de barre est exprimée en pourcentage du poids de corps du sujet de référence de 70 kg.</w:t>
       </w:r>
     </w:p>
     <w:p>
@@ -405,17 +1387,105 @@
     </w:p>
     <w:p>
       <w:r>
-        <w:t>Comparer `duration_slow` et `duration_fast` avec posture, charge et prise de barre constantes.</w:t>
+        <w:t xml:space="preserve">Comparer </w:t>
+      </w:r>
+      <w:r>
+        <w:rPr>
+          <w:rFonts w:ascii="Aptos Mono" w:hAnsi="Aptos Mono"/>
+          <w:color w:val="1F4D78"/>
+          <w:sz w:val="19"/>
+        </w:rPr>
+        <w:t>duration_slow</w:t>
+      </w:r>
+      <w:r>
+        <w:t xml:space="preserve"> et </w:t>
+      </w:r>
+      <w:r>
+        <w:rPr>
+          <w:rFonts w:ascii="Aptos Mono" w:hAnsi="Aptos Mono"/>
+          <w:color w:val="1F4D78"/>
+          <w:sz w:val="19"/>
+        </w:rPr>
+        <w:t>duration_fast</w:t>
+      </w:r>
+      <w:r>
+        <w:t xml:space="preserve"> avec posture, charge et prise de barre constantes. Dans le GUI, reproduire cette comparaison avec les presets </w:t>
+      </w:r>
+      <w:r>
+        <w:rPr>
+          <w:rFonts w:ascii="Aptos Mono" w:hAnsi="Aptos Mono"/>
+          <w:color w:val="1F4D78"/>
+          <w:sz w:val="19"/>
+        </w:rPr>
+        <w:t>Lent 6/2/6</w:t>
+      </w:r>
+      <w:r>
+        <w:t xml:space="preserve"> et </w:t>
+      </w:r>
+      <w:r>
+        <w:rPr>
+          <w:rFonts w:ascii="Aptos Mono" w:hAnsi="Aptos Mono"/>
+          <w:color w:val="1F4D78"/>
+          <w:sz w:val="19"/>
+        </w:rPr>
+        <w:t>Rapide 2/0,5/2</w:t>
+      </w:r>
+      <w:r>
+        <w:t>, puis utiliser le curseur synchronisé pour comparer les mêmes événements du mouvement.</w:t>
       </w:r>
     </w:p>
     <w:p>
       <w:r>
-        <w:t>Hypothèse : réduire la durée augmente les accélérations et peut modifier la part des efforts inertiels/non-linéaires dans le couple total.</w:t>
+        <w:t xml:space="preserve">Hypothèse : réduire la durée augmente les accélérations et peut modifier les parts </w:t>
+      </w:r>
+      <w:r>
+        <w:rPr>
+          <w:rFonts w:ascii="Aptos Mono" w:hAnsi="Aptos Mono"/>
+          <w:color w:val="1F4D78"/>
+          <w:sz w:val="19"/>
+        </w:rPr>
+        <w:t>M(q)q̈</w:t>
+      </w:r>
+      <w:r>
+        <w:t xml:space="preserve"> et dépendante de </w:t>
+      </w:r>
+      <w:r>
+        <w:rPr>
+          <w:rFonts w:ascii="Aptos Mono" w:hAnsi="Aptos Mono"/>
+          <w:color w:val="1F4D78"/>
+          <w:sz w:val="19"/>
+        </w:rPr>
+        <w:t>q̇</w:t>
+      </w:r>
+      <w:r>
+        <w:t xml:space="preserve"> dans le couple total.</w:t>
       </w:r>
     </w:p>
     <w:p>
       <w:r>
-        <w:t>Variables à extraire : couple total de dynamique inverse, effet du contact, efforts inertiels/non-linéaires (`total - contact`) et puissance.</w:t>
+        <w:t xml:space="preserve">Variables à extraire : couple total de dynamique inverse, </w:t>
+      </w:r>
+      <w:r>
+        <w:rPr>
+          <w:rFonts w:ascii="Aptos Mono" w:hAnsi="Aptos Mono"/>
+          <w:color w:val="1F4D78"/>
+          <w:sz w:val="19"/>
+        </w:rPr>
+        <w:t>M(q)q̈</w:t>
+      </w:r>
+      <w:r>
+        <w:t xml:space="preserve">, termes dépendant de </w:t>
+      </w:r>
+      <w:r>
+        <w:rPr>
+          <w:rFonts w:ascii="Aptos Mono" w:hAnsi="Aptos Mono"/>
+          <w:color w:val="1F4D78"/>
+          <w:sz w:val="19"/>
+        </w:rPr>
+        <w:t>q̇</w:t>
+      </w:r>
+      <w:r>
+        <w:t>, gravité, effet externe signé du contact, résidu de reconstruction et puissance.</w:t>
       </w:r>
     </w:p>
     <w:p>
@@ -438,7 +1508,12 @@
     </w:p>
     <w:p>
       <w:pPr>
-        <w:pStyle w:val="ListBullet"/>
+        <w:keepNext/>
+        <w:spacing w:after="80" w:line="300" w:lineRule="auto"/>
+        <w:numPr>
+          <w:ilvl w:val="0"/>
+          <w:numId w:val="16"/>
+        </w:numPr>
       </w:pPr>
       <w:r>
         <w:t>minimiser la demande relative au genou;</w:t>
@@ -446,7 +1521,11 @@
     </w:p>
     <w:p>
       <w:pPr>
-        <w:pStyle w:val="ListBullet"/>
+        <w:spacing w:after="80" w:line="300" w:lineRule="auto"/>
+        <w:numPr>
+          <w:ilvl w:val="0"/>
+          <w:numId w:val="16"/>
+        </w:numPr>
       </w:pPr>
       <w:r>
         <w:t>maximiser la sollicitation du genou sans dépasser les capacités;</w:t>
@@ -454,7 +1533,11 @@
     </w:p>
     <w:p>
       <w:pPr>
-        <w:pStyle w:val="ListBullet"/>
+        <w:spacing w:after="80" w:line="300" w:lineRule="auto"/>
+        <w:numPr>
+          <w:ilvl w:val="0"/>
+          <w:numId w:val="16"/>
+        </w:numPr>
       </w:pPr>
       <w:r>
         <w:t>garder le CoP au centre du pied;</w:t>
@@ -462,7 +1545,11 @@
     </w:p>
     <w:p>
       <w:pPr>
-        <w:pStyle w:val="ListBullet"/>
+        <w:spacing w:after="80" w:line="300" w:lineRule="auto"/>
+        <w:numPr>
+          <w:ilvl w:val="0"/>
+          <w:numId w:val="16"/>
+        </w:numPr>
       </w:pPr>
       <w:r>
         <w:t>adapter la posture pour préserver l’équilibre après un changement de morphologie ou de prise de barre;</w:t>
@@ -470,7 +1557,11 @@
     </w:p>
     <w:p>
       <w:pPr>
-        <w:pStyle w:val="ListBullet"/>
+        <w:spacing w:after="80" w:line="300" w:lineRule="auto"/>
+        <w:numPr>
+          <w:ilvl w:val="0"/>
+          <w:numId w:val="16"/>
+        </w:numPr>
       </w:pPr>
       <w:r>
         <w:t>augmenter la charge sans dépasser 80 % de capacité;</w:t>
@@ -478,7 +1569,11 @@
     </w:p>
     <w:p>
       <w:pPr>
-        <w:pStyle w:val="ListBullet"/>
+        <w:spacing w:after="80" w:line="300" w:lineRule="auto"/>
+        <w:numPr>
+          <w:ilvl w:val="0"/>
+          <w:numId w:val="16"/>
+        </w:numPr>
       </w:pPr>
       <w:r>
         <w:t>augmenter la vitesse tout en limitant la part inertielle.</w:t>
@@ -499,15 +1594,35 @@
     </w:p>
     <w:p>
       <w:pPr>
-        <w:pStyle w:val="ListNumber"/>
+        <w:keepNext/>
+        <w:spacing w:after="80" w:line="300" w:lineRule="auto"/>
+        <w:numPr>
+          <w:ilvl w:val="0"/>
+          <w:numId w:val="17"/>
+        </w:numPr>
       </w:pPr>
       <w:r>
-        <w:t>fichier de résultats ou résumé `summary_metrics.csv`;</w:t>
+        <w:t xml:space="preserve">fichier de résultats ou résumé </w:t>
+      </w:r>
+      <w:r>
+        <w:rPr>
+          <w:rFonts w:ascii="Aptos Mono" w:hAnsi="Aptos Mono"/>
+          <w:color w:val="1F4D78"/>
+          <w:sz w:val="19"/>
+        </w:rPr>
+        <w:t>summary_metrics.csv</w:t>
+      </w:r>
+      <w:r>
+        <w:t>;</w:t>
       </w:r>
     </w:p>
     <w:p>
       <w:pPr>
-        <w:pStyle w:val="ListNumber"/>
+        <w:spacing w:after="80" w:line="300" w:lineRule="auto"/>
+        <w:numPr>
+          <w:ilvl w:val="0"/>
+          <w:numId w:val="17"/>
+        </w:numPr>
       </w:pPr>
       <w:r>
         <w:t>figures comparatives;</w:t>
@@ -515,7 +1630,11 @@
     </w:p>
     <w:p>
       <w:pPr>
-        <w:pStyle w:val="ListNumber"/>
+        <w:spacing w:after="80" w:line="300" w:lineRule="auto"/>
+        <w:numPr>
+          <w:ilvl w:val="0"/>
+          <w:numId w:val="17"/>
+        </w:numPr>
       </w:pPr>
       <w:r>
         <w:t>réponses au questionnaire ou aux questions remises par l’enseignant;</w:t>
@@ -523,7 +1642,11 @@
     </w:p>
     <w:p>
       <w:pPr>
-        <w:pStyle w:val="ListNumber"/>
+        <w:spacing w:after="80" w:line="300" w:lineRule="auto"/>
+        <w:numPr>
+          <w:ilvl w:val="0"/>
+          <w:numId w:val="17"/>
+        </w:numPr>
       </w:pPr>
       <w:r>
         <w:t>court rapport de 2 à 4 pages;</w:t>
@@ -531,7 +1654,11 @@
     </w:p>
     <w:p>
       <w:pPr>
-        <w:pStyle w:val="ListNumber"/>
+        <w:spacing w:after="80" w:line="300" w:lineRule="auto"/>
+        <w:numPr>
+          <w:ilvl w:val="0"/>
+          <w:numId w:val="17"/>
+        </w:numPr>
       </w:pPr>
       <w:r>
         <w:t>conclusion pratique : que peut-on recommander, et à quelles conditions?</w:t>
@@ -549,34 +1676,38 @@
       <w:tblPr>
         <w:tblStyle w:val="TableGrid"/>
         <w:tblW w:type="dxa" w:w="9360"/>
-        <w:jc w:val="center"/>
         <w:tblLayout w:type="fixed"/>
         <w:tblLook w:firstColumn="1" w:firstRow="1" w:lastColumn="0" w:lastRow="0" w:noHBand="0" w:noVBand="1" w:val="04A0"/>
+        <w:tblInd w:w="120" w:type="dxa"/>
       </w:tblPr>
       <w:tblGrid>
-        <w:gridCol w:w="7300"/>
-        <w:gridCol w:w="2060"/>
+        <w:gridCol w:w="7600"/>
+        <w:gridCol w:w="1760"/>
       </w:tblGrid>
       <w:tr>
         <w:trPr>
-          <w:tblHeader w:val="true"/>
+          <w:cantSplit/>
         </w:trPr>
         <w:tc>
           <w:tcPr>
-            <w:tcW w:type="dxa" w:w="7300"/>
+            <w:tcW w:type="dxa" w:w="7600"/>
             <w:tcMar>
               <w:top w:w="80" w:type="dxa"/>
+              <w:start w:w="120" w:type="dxa"/>
               <w:bottom w:w="80" w:type="dxa"/>
-              <w:start w:w="120" w:type="dxa"/>
               <w:end w:w="120" w:type="dxa"/>
             </w:tcMar>
             <w:vAlign w:val="center"/>
             <w:shd w:fill="E8EEF5"/>
           </w:tcPr>
           <w:p>
+            <w:pPr>
+              <w:spacing w:after="0"/>
+            </w:pPr>
             <w:r>
               <w:rPr>
                 <w:b/>
+                <w:color w:val="1F4D78"/>
               </w:rPr>
               <w:t>Critère</w:t>
             </w:r>
@@ -584,20 +1715,25 @@
         </w:tc>
         <w:tc>
           <w:tcPr>
-            <w:tcW w:type="dxa" w:w="2060"/>
+            <w:tcW w:type="dxa" w:w="1760"/>
             <w:tcMar>
               <w:top w:w="80" w:type="dxa"/>
+              <w:start w:w="120" w:type="dxa"/>
               <w:bottom w:w="80" w:type="dxa"/>
-              <w:start w:w="120" w:type="dxa"/>
               <w:end w:w="120" w:type="dxa"/>
             </w:tcMar>
             <w:vAlign w:val="center"/>
             <w:shd w:fill="E8EEF5"/>
           </w:tcPr>
           <w:p>
+            <w:pPr>
+              <w:spacing w:after="0"/>
+              <w:jc w:val="right"/>
+            </w:pPr>
             <w:r>
               <w:rPr>
                 <w:b/>
+                <w:color w:val="1F4D78"/>
               </w:rPr>
               <w:t>Points</w:t>
             </w:r>
@@ -605,18 +1741,24 @@
         </w:tc>
       </w:tr>
       <w:tr>
+        <w:trPr>
+          <w:cantSplit/>
+        </w:trPr>
         <w:tc>
           <w:tcPr>
-            <w:tcW w:type="dxa" w:w="7300"/>
+            <w:tcW w:type="dxa" w:w="7600"/>
             <w:tcMar>
               <w:top w:w="80" w:type="dxa"/>
+              <w:start w:w="120" w:type="dxa"/>
               <w:bottom w:w="80" w:type="dxa"/>
-              <w:start w:w="120" w:type="dxa"/>
               <w:end w:w="120" w:type="dxa"/>
             </w:tcMar>
             <w:vAlign w:val="center"/>
           </w:tcPr>
           <w:p>
+            <w:pPr>
+              <w:spacing w:after="0"/>
+            </w:pPr>
             <w:r>
               <w:t>Simulations reproductibles et bien comparées</w:t>
             </w:r>
@@ -624,16 +1766,20 @@
         </w:tc>
         <w:tc>
           <w:tcPr>
-            <w:tcW w:type="dxa" w:w="2060"/>
+            <w:tcW w:type="dxa" w:w="1760"/>
             <w:tcMar>
               <w:top w:w="80" w:type="dxa"/>
+              <w:start w:w="120" w:type="dxa"/>
               <w:bottom w:w="80" w:type="dxa"/>
-              <w:start w:w="120" w:type="dxa"/>
               <w:end w:w="120" w:type="dxa"/>
             </w:tcMar>
             <w:vAlign w:val="center"/>
           </w:tcPr>
           <w:p>
+            <w:pPr>
+              <w:spacing w:after="0"/>
+              <w:jc w:val="right"/>
+            </w:pPr>
             <w:r>
               <w:t>20</w:t>
             </w:r>
@@ -641,18 +1787,24 @@
         </w:tc>
       </w:tr>
       <w:tr>
+        <w:trPr>
+          <w:cantSplit/>
+        </w:trPr>
         <w:tc>
           <w:tcPr>
-            <w:tcW w:type="dxa" w:w="7300"/>
+            <w:tcW w:type="dxa" w:w="7600"/>
             <w:tcMar>
               <w:top w:w="80" w:type="dxa"/>
+              <w:start w:w="120" w:type="dxa"/>
               <w:bottom w:w="80" w:type="dxa"/>
-              <w:start w:w="120" w:type="dxa"/>
               <w:end w:w="120" w:type="dxa"/>
             </w:tcMar>
             <w:vAlign w:val="center"/>
           </w:tcPr>
           <w:p>
+            <w:pPr>
+              <w:spacing w:after="0"/>
+            </w:pPr>
             <w:r>
               <w:t>Analyse des moments, CoP/ZMP et ratios d’effort</w:t>
             </w:r>
@@ -660,16 +1812,20 @@
         </w:tc>
         <w:tc>
           <w:tcPr>
-            <w:tcW w:type="dxa" w:w="2060"/>
+            <w:tcW w:type="dxa" w:w="1760"/>
             <w:tcMar>
               <w:top w:w="80" w:type="dxa"/>
+              <w:start w:w="120" w:type="dxa"/>
               <w:bottom w:w="80" w:type="dxa"/>
-              <w:start w:w="120" w:type="dxa"/>
               <w:end w:w="120" w:type="dxa"/>
             </w:tcMar>
             <w:vAlign w:val="center"/>
           </w:tcPr>
           <w:p>
+            <w:pPr>
+              <w:spacing w:after="0"/>
+              <w:jc w:val="right"/>
+            </w:pPr>
             <w:r>
               <w:t>20</w:t>
             </w:r>
@@ -677,18 +1833,24 @@
         </w:tc>
       </w:tr>
       <w:tr>
+        <w:trPr>
+          <w:cantSplit/>
+        </w:trPr>
         <w:tc>
           <w:tcPr>
-            <w:tcW w:type="dxa" w:w="7300"/>
+            <w:tcW w:type="dxa" w:w="7600"/>
             <w:tcMar>
               <w:top w:w="80" w:type="dxa"/>
+              <w:start w:w="120" w:type="dxa"/>
               <w:bottom w:w="80" w:type="dxa"/>
-              <w:start w:w="120" w:type="dxa"/>
               <w:end w:w="120" w:type="dxa"/>
             </w:tcMar>
             <w:vAlign w:val="center"/>
           </w:tcPr>
           <w:p>
+            <w:pPr>
+              <w:spacing w:after="0"/>
+            </w:pPr>
             <w:r>
               <w:t>Équilibre morphologie / prise de barre et adaptation proposée</w:t>
             </w:r>
@@ -696,16 +1858,20 @@
         </w:tc>
         <w:tc>
           <w:tcPr>
-            <w:tcW w:type="dxa" w:w="2060"/>
+            <w:tcW w:type="dxa" w:w="1760"/>
             <w:tcMar>
               <w:top w:w="80" w:type="dxa"/>
+              <w:start w:w="120" w:type="dxa"/>
               <w:bottom w:w="80" w:type="dxa"/>
-              <w:start w:w="120" w:type="dxa"/>
               <w:end w:w="120" w:type="dxa"/>
             </w:tcMar>
             <w:vAlign w:val="center"/>
           </w:tcPr>
           <w:p>
+            <w:pPr>
+              <w:spacing w:after="0"/>
+              <w:jc w:val="right"/>
+            </w:pPr>
             <w:r>
               <w:t>15</w:t>
             </w:r>
@@ -713,35 +1879,67 @@
         </w:tc>
       </w:tr>
       <w:tr>
+        <w:trPr>
+          <w:cantSplit/>
+        </w:trPr>
         <w:tc>
           <w:tcPr>
-            <w:tcW w:type="dxa" w:w="7300"/>
+            <w:tcW w:type="dxa" w:w="7600"/>
             <w:tcMar>
               <w:top w:w="80" w:type="dxa"/>
+              <w:start w:w="120" w:type="dxa"/>
               <w:bottom w:w="80" w:type="dxa"/>
-              <w:start w:w="120" w:type="dxa"/>
               <w:end w:w="120" w:type="dxa"/>
             </w:tcMar>
             <w:vAlign w:val="center"/>
           </w:tcPr>
           <w:p>
+            <w:pPr>
+              <w:spacing w:after="0"/>
+            </w:pPr>
             <w:r>
-              <w:t>Analyse dynamique total, contact, inertiels/non-linéaires et durée</w:t>
+              <w:t xml:space="preserve">Analyse dynamique total, </w:t>
+            </w:r>
+            <w:r>
+              <w:rPr>
+                <w:rFonts w:ascii="Aptos Mono" w:hAnsi="Aptos Mono"/>
+                <w:color w:val="1F4D78"/>
+                <w:sz w:val="19"/>
+              </w:rPr>
+              <w:t>M(q)q̈</w:t>
+            </w:r>
+            <w:r>
+              <w:t xml:space="preserve">, </w:t>
+            </w:r>
+            <w:r>
+              <w:rPr>
+                <w:rFonts w:ascii="Aptos Mono" w:hAnsi="Aptos Mono"/>
+                <w:color w:val="1F4D78"/>
+                <w:sz w:val="19"/>
+              </w:rPr>
+              <w:t>q̇</w:t>
+            </w:r>
+            <w:r>
+              <w:t>, gravité, contact et durée</w:t>
             </w:r>
           </w:p>
         </w:tc>
         <w:tc>
           <w:tcPr>
-            <w:tcW w:type="dxa" w:w="2060"/>
+            <w:tcW w:type="dxa" w:w="1760"/>
             <w:tcMar>
               <w:top w:w="80" w:type="dxa"/>
+              <w:start w:w="120" w:type="dxa"/>
               <w:bottom w:w="80" w:type="dxa"/>
-              <w:start w:w="120" w:type="dxa"/>
               <w:end w:w="120" w:type="dxa"/>
             </w:tcMar>
             <w:vAlign w:val="center"/>
           </w:tcPr>
           <w:p>
+            <w:pPr>
+              <w:spacing w:after="0"/>
+              <w:jc w:val="right"/>
+            </w:pPr>
             <w:r>
               <w:t>10</w:t>
             </w:r>
@@ -749,18 +1947,24 @@
         </w:tc>
       </w:tr>
       <w:tr>
+        <w:trPr>
+          <w:cantSplit/>
+        </w:trPr>
         <w:tc>
           <w:tcPr>
-            <w:tcW w:type="dxa" w:w="7300"/>
+            <w:tcW w:type="dxa" w:w="7600"/>
             <w:tcMar>
               <w:top w:w="80" w:type="dxa"/>
+              <w:start w:w="120" w:type="dxa"/>
               <w:bottom w:w="80" w:type="dxa"/>
-              <w:start w:w="120" w:type="dxa"/>
               <w:end w:w="120" w:type="dxa"/>
             </w:tcMar>
             <w:vAlign w:val="center"/>
           </w:tcPr>
           <w:p>
+            <w:pPr>
+              <w:spacing w:after="0"/>
+            </w:pPr>
             <w:r>
               <w:t>Utilisation pertinente de la littérature</w:t>
             </w:r>
@@ -768,16 +1972,20 @@
         </w:tc>
         <w:tc>
           <w:tcPr>
-            <w:tcW w:type="dxa" w:w="2060"/>
+            <w:tcW w:type="dxa" w:w="1760"/>
             <w:tcMar>
               <w:top w:w="80" w:type="dxa"/>
+              <w:start w:w="120" w:type="dxa"/>
               <w:bottom w:w="80" w:type="dxa"/>
-              <w:start w:w="120" w:type="dxa"/>
               <w:end w:w="120" w:type="dxa"/>
             </w:tcMar>
             <w:vAlign w:val="center"/>
           </w:tcPr>
           <w:p>
+            <w:pPr>
+              <w:spacing w:after="0"/>
+              <w:jc w:val="right"/>
+            </w:pPr>
             <w:r>
               <w:t>20</w:t>
             </w:r>
@@ -785,18 +1993,24 @@
         </w:tc>
       </w:tr>
       <w:tr>
+        <w:trPr>
+          <w:cantSplit/>
+        </w:trPr>
         <w:tc>
           <w:tcPr>
-            <w:tcW w:type="dxa" w:w="7300"/>
+            <w:tcW w:type="dxa" w:w="7600"/>
             <w:tcMar>
               <w:top w:w="80" w:type="dxa"/>
+              <w:start w:w="120" w:type="dxa"/>
               <w:bottom w:w="80" w:type="dxa"/>
-              <w:start w:w="120" w:type="dxa"/>
               <w:end w:w="120" w:type="dxa"/>
             </w:tcMar>
             <w:vAlign w:val="center"/>
           </w:tcPr>
           <w:p>
+            <w:pPr>
+              <w:spacing w:after="0"/>
+            </w:pPr>
             <w:r>
               <w:t>Recommandation pratique nuancée</w:t>
             </w:r>
@@ -804,16 +2018,20 @@
         </w:tc>
         <w:tc>
           <w:tcPr>
-            <w:tcW w:type="dxa" w:w="2060"/>
+            <w:tcW w:type="dxa" w:w="1760"/>
             <w:tcMar>
               <w:top w:w="80" w:type="dxa"/>
+              <w:start w:w="120" w:type="dxa"/>
               <w:bottom w:w="80" w:type="dxa"/>
-              <w:start w:w="120" w:type="dxa"/>
               <w:end w:w="120" w:type="dxa"/>
             </w:tcMar>
             <w:vAlign w:val="center"/>
           </w:tcPr>
           <w:p>
+            <w:pPr>
+              <w:spacing w:after="0"/>
+              <w:jc w:val="right"/>
+            </w:pPr>
             <w:r>
               <w:t>10</w:t>
             </w:r>
@@ -821,18 +2039,24 @@
         </w:tc>
       </w:tr>
       <w:tr>
+        <w:trPr>
+          <w:cantSplit/>
+        </w:trPr>
         <w:tc>
           <w:tcPr>
-            <w:tcW w:type="dxa" w:w="7300"/>
+            <w:tcW w:type="dxa" w:w="7600"/>
             <w:tcMar>
               <w:top w:w="80" w:type="dxa"/>
+              <w:start w:w="120" w:type="dxa"/>
               <w:bottom w:w="80" w:type="dxa"/>
-              <w:start w:w="120" w:type="dxa"/>
               <w:end w:w="120" w:type="dxa"/>
             </w:tcMar>
             <w:vAlign w:val="center"/>
           </w:tcPr>
           <w:p>
+            <w:pPr>
+              <w:spacing w:after="0"/>
+            </w:pPr>
             <w:r>
               <w:t>Clarté des figures et tableaux</w:t>
             </w:r>
@@ -840,16 +2064,20 @@
         </w:tc>
         <w:tc>
           <w:tcPr>
-            <w:tcW w:type="dxa" w:w="2060"/>
+            <w:tcW w:type="dxa" w:w="1760"/>
             <w:tcMar>
               <w:top w:w="80" w:type="dxa"/>
+              <w:start w:w="120" w:type="dxa"/>
               <w:bottom w:w="80" w:type="dxa"/>
-              <w:start w:w="120" w:type="dxa"/>
               <w:end w:w="120" w:type="dxa"/>
             </w:tcMar>
             <w:vAlign w:val="center"/>
           </w:tcPr>
           <w:p>
+            <w:pPr>
+              <w:spacing w:after="0"/>
+              <w:jc w:val="right"/>
+            </w:pPr>
             <w:r>
               <w:t>5</w:t>
             </w:r>
@@ -857,9 +2085,18 @@
         </w:tc>
       </w:tr>
     </w:tbl>
-    <w:p/>
+    <w:p>
+      <w:pPr>
+        <w:spacing w:after="0"/>
+      </w:pPr>
+    </w:p>
     <w:sectPr>
-      <w:footerReference w:type="default" r:id="rId9"/>
+      <w:headerReference w:type="default" r:id="rId9"/>
+      <w:headerReference w:type="even" r:id="rId10"/>
+      <w:headerReference w:type="first" r:id="rId11"/>
+      <w:footerReference w:type="default" r:id="rId12"/>
+      <w:footerReference w:type="even" r:id="rId13"/>
+      <w:footerReference w:type="first" r:id="rId14"/>
       <w:pgSz w:w="12240" w:h="15840"/>
       <w:pgMar w:top="1440" w:right="1440" w:bottom="1440" w:left="1440" w:header="708" w:footer="708" w:gutter="0"/>
       <w:cols w:space="720"/>
@@ -879,13 +2116,111 @@
     <w:r>
       <w:rPr>
         <w:rFonts w:ascii="Calibri" w:hAnsi="Calibri"/>
-        <w:color w:val="666666"/>
-        <w:sz w:val="18"/>
-      </w:rPr>
-      <w:t>Guide étudiant | Squat_GUI</w:t>
+        <w:color w:val="5B6573"/>
+        <w:sz w:val="16"/>
+      </w:rPr>
+      <w:t xml:space="preserve">Guide étudiant  •  </w:t>
+    </w:r>
+    <w:fldSimple w:instr="PAGE"/>
+  </w:p>
+</w:ftr>
+</file>
+
+<file path=word/footer2.xml><?xml version="1.0" encoding="utf-8"?>
+<w:ftr xmlns:m="http://schemas.openxmlformats.org/officeDocument/2006/math" xmlns:mc="http://schemas.openxmlformats.org/markup-compatibility/2006" xmlns:mo="http://schemas.microsoft.com/office/mac/office/2008/main" xmlns:mv="urn:schemas-microsoft-com:mac:vml" xmlns:o="urn:schemas-microsoft-com:office:office" xmlns:r="http://schemas.openxmlformats.org/officeDocument/2006/relationships" xmlns:v="urn:schemas-microsoft-com:vml" xmlns:w10="urn:schemas-microsoft-com:office:word" xmlns:w14="http://schemas.microsoft.com/office/word/2010/wordml" xmlns:w="http://schemas.openxmlformats.org/wordprocessingml/2006/main" xmlns:wne="http://schemas.microsoft.com/office/word/2006/wordml" xmlns:wp14="http://schemas.microsoft.com/office/word/2010/wordprocessingDrawing" xmlns:wp="http://schemas.openxmlformats.org/drawingml/2006/wordprocessingDrawing" xmlns:wpc="http://schemas.microsoft.com/office/word/2010/wordprocessingCanvas" xmlns:wpg="http://schemas.microsoft.com/office/word/2010/wordprocessingGroup" xmlns:wpi="http://schemas.microsoft.com/office/word/2010/wordprocessingInk" xmlns:wps="http://schemas.microsoft.com/office/word/2010/wordprocessingShape" mc:Ignorable="w14 wp14">
+  <w:p>
+    <w:pPr>
+      <w:pStyle w:val="Footer"/>
+      <w:jc w:val="right"/>
+    </w:pPr>
+    <w:r>
+      <w:rPr>
+        <w:rFonts w:ascii="Calibri" w:hAnsi="Calibri"/>
+        <w:color w:val="5B6573"/>
+        <w:sz w:val="16"/>
+      </w:rPr>
+      <w:t xml:space="preserve">Guide étudiant  •  </w:t>
+    </w:r>
+    <w:fldSimple w:instr="PAGE"/>
+  </w:p>
+</w:ftr>
+</file>
+
+<file path=word/footer3.xml><?xml version="1.0" encoding="utf-8"?>
+<w:ftr xmlns:m="http://schemas.openxmlformats.org/officeDocument/2006/math" xmlns:mc="http://schemas.openxmlformats.org/markup-compatibility/2006" xmlns:mo="http://schemas.microsoft.com/office/mac/office/2008/main" xmlns:mv="urn:schemas-microsoft-com:mac:vml" xmlns:o="urn:schemas-microsoft-com:office:office" xmlns:r="http://schemas.openxmlformats.org/officeDocument/2006/relationships" xmlns:v="urn:schemas-microsoft-com:vml" xmlns:w10="urn:schemas-microsoft-com:office:word" xmlns:w14="http://schemas.microsoft.com/office/word/2010/wordml" xmlns:w="http://schemas.openxmlformats.org/wordprocessingml/2006/main" xmlns:wne="http://schemas.microsoft.com/office/word/2006/wordml" xmlns:wp14="http://schemas.microsoft.com/office/word/2010/wordprocessingDrawing" xmlns:wp="http://schemas.openxmlformats.org/drawingml/2006/wordprocessingDrawing" xmlns:wpc="http://schemas.microsoft.com/office/word/2010/wordprocessingCanvas" xmlns:wpg="http://schemas.microsoft.com/office/word/2010/wordprocessingGroup" xmlns:wpi="http://schemas.microsoft.com/office/word/2010/wordprocessingInk" xmlns:wps="http://schemas.microsoft.com/office/word/2010/wordprocessingShape" mc:Ignorable="w14 wp14">
+  <w:p>
+    <w:pPr>
+      <w:pStyle w:val="Footer"/>
+      <w:jc w:val="right"/>
+    </w:pPr>
+    <w:r>
+      <w:rPr>
+        <w:rFonts w:ascii="Calibri" w:hAnsi="Calibri"/>
+        <w:color w:val="5B6573"/>
+        <w:sz w:val="16"/>
+      </w:rPr>
+      <w:t xml:space="preserve">Guide étudiant  •  </w:t>
+    </w:r>
+    <w:fldSimple w:instr="PAGE"/>
+  </w:p>
+</w:ftr>
+</file>
+
+<file path=word/header1.xml><?xml version="1.0" encoding="utf-8"?>
+<w:hdr xmlns:m="http://schemas.openxmlformats.org/officeDocument/2006/math" xmlns:mc="http://schemas.openxmlformats.org/markup-compatibility/2006" xmlns:mo="http://schemas.microsoft.com/office/mac/office/2008/main" xmlns:mv="urn:schemas-microsoft-com:mac:vml" xmlns:o="urn:schemas-microsoft-com:office:office" xmlns:r="http://schemas.openxmlformats.org/officeDocument/2006/relationships" xmlns:v="urn:schemas-microsoft-com:vml" xmlns:w10="urn:schemas-microsoft-com:office:word" xmlns:w14="http://schemas.microsoft.com/office/word/2010/wordml" xmlns:w="http://schemas.openxmlformats.org/wordprocessingml/2006/main" xmlns:wne="http://schemas.microsoft.com/office/word/2006/wordml" xmlns:wp14="http://schemas.microsoft.com/office/word/2010/wordprocessingDrawing" xmlns:wp="http://schemas.openxmlformats.org/drawingml/2006/wordprocessingDrawing" xmlns:wpc="http://schemas.microsoft.com/office/word/2010/wordprocessingCanvas" xmlns:wpg="http://schemas.microsoft.com/office/word/2010/wordprocessingGroup" xmlns:wpi="http://schemas.microsoft.com/office/word/2010/wordprocessingInk" xmlns:wps="http://schemas.microsoft.com/office/word/2010/wordprocessingShape" mc:Ignorable="w14 wp14">
+  <w:p>
+    <w:pPr>
+      <w:pStyle w:val="Header"/>
+      <w:jc w:val="right"/>
+    </w:pPr>
+    <w:r>
+      <w:rPr>
+        <w:rFonts w:ascii="Calibri" w:hAnsi="Calibri"/>
+        <w:color w:val="5B6573"/>
+        <w:sz w:val="16"/>
+      </w:rPr>
+      <w:t>LABORATOIRE DE BIOMÉCANIQUE — SQUAT 2D</w:t>
     </w:r>
   </w:p>
-</w:ftr>
+</w:hdr>
+</file>
+
+<file path=word/header2.xml><?xml version="1.0" encoding="utf-8"?>
+<w:hdr xmlns:m="http://schemas.openxmlformats.org/officeDocument/2006/math" xmlns:mc="http://schemas.openxmlformats.org/markup-compatibility/2006" xmlns:mo="http://schemas.microsoft.com/office/mac/office/2008/main" xmlns:mv="urn:schemas-microsoft-com:mac:vml" xmlns:o="urn:schemas-microsoft-com:office:office" xmlns:r="http://schemas.openxmlformats.org/officeDocument/2006/relationships" xmlns:v="urn:schemas-microsoft-com:vml" xmlns:w10="urn:schemas-microsoft-com:office:word" xmlns:w14="http://schemas.microsoft.com/office/word/2010/wordml" xmlns:w="http://schemas.openxmlformats.org/wordprocessingml/2006/main" xmlns:wne="http://schemas.microsoft.com/office/word/2006/wordml" xmlns:wp14="http://schemas.microsoft.com/office/word/2010/wordprocessingDrawing" xmlns:wp="http://schemas.openxmlformats.org/drawingml/2006/wordprocessingDrawing" xmlns:wpc="http://schemas.microsoft.com/office/word/2010/wordprocessingCanvas" xmlns:wpg="http://schemas.microsoft.com/office/word/2010/wordprocessingGroup" xmlns:wpi="http://schemas.microsoft.com/office/word/2010/wordprocessingInk" xmlns:wps="http://schemas.microsoft.com/office/word/2010/wordprocessingShape" mc:Ignorable="w14 wp14">
+  <w:p>
+    <w:pPr>
+      <w:pStyle w:val="Header"/>
+      <w:jc w:val="right"/>
+    </w:pPr>
+    <w:r>
+      <w:rPr>
+        <w:rFonts w:ascii="Calibri" w:hAnsi="Calibri"/>
+        <w:color w:val="5B6573"/>
+        <w:sz w:val="16"/>
+      </w:rPr>
+      <w:t>LABORATOIRE DE BIOMÉCANIQUE — SQUAT 2D</w:t>
+    </w:r>
+  </w:p>
+</w:hdr>
+</file>
+
+<file path=word/header3.xml><?xml version="1.0" encoding="utf-8"?>
+<w:hdr xmlns:m="http://schemas.openxmlformats.org/officeDocument/2006/math" xmlns:mc="http://schemas.openxmlformats.org/markup-compatibility/2006" xmlns:mo="http://schemas.microsoft.com/office/mac/office/2008/main" xmlns:mv="urn:schemas-microsoft-com:mac:vml" xmlns:o="urn:schemas-microsoft-com:office:office" xmlns:r="http://schemas.openxmlformats.org/officeDocument/2006/relationships" xmlns:v="urn:schemas-microsoft-com:vml" xmlns:w10="urn:schemas-microsoft-com:office:word" xmlns:w14="http://schemas.microsoft.com/office/word/2010/wordml" xmlns:w="http://schemas.openxmlformats.org/wordprocessingml/2006/main" xmlns:wne="http://schemas.microsoft.com/office/word/2006/wordml" xmlns:wp14="http://schemas.microsoft.com/office/word/2010/wordprocessingDrawing" xmlns:wp="http://schemas.openxmlformats.org/drawingml/2006/wordprocessingDrawing" xmlns:wpc="http://schemas.microsoft.com/office/word/2010/wordprocessingCanvas" xmlns:wpg="http://schemas.microsoft.com/office/word/2010/wordprocessingGroup" xmlns:wpi="http://schemas.microsoft.com/office/word/2010/wordprocessingInk" xmlns:wps="http://schemas.microsoft.com/office/word/2010/wordprocessingShape" mc:Ignorable="w14 wp14">
+  <w:p>
+    <w:pPr>
+      <w:pStyle w:val="Header"/>
+      <w:jc w:val="right"/>
+    </w:pPr>
+    <w:r>
+      <w:rPr>
+        <w:rFonts w:ascii="Calibri" w:hAnsi="Calibri"/>
+        <w:color w:val="5B6573"/>
+        <w:sz w:val="16"/>
+      </w:rPr>
+      <w:t>LABORATOIRE DE BIOMÉCANIQUE — SQUAT 2D</w:t>
+    </w:r>
+  </w:p>
+</w:hdr>
 </file>
 
 <file path=word/numbering.xml><?xml version="1.0" encoding="utf-8"?>
@@ -1087,6 +2422,150 @@
   </w:num>
   <w:num w:numId="9">
     <w:abstractNumId w:val="0"/>
+  </w:num>
+  <w:abstractNum w:abstractNumId="9">
+    <w:multiLevelType w:val="singleLevel"/>
+    <w:lvl w:ilvl="0">
+      <w:start w:val="1"/>
+      <w:numFmt w:val="decimal"/>
+      <w:lvlText w:val="%1."/>
+      <w:lvlJc w:val="left"/>
+      <w:pPr>
+        <w:tabs>
+          <w:tab w:val="num" w:pos="540"/>
+        </w:tabs>
+        <w:ind w:left="540" w:hanging="270"/>
+      </w:pPr>
+    </w:lvl>
+  </w:abstractNum>
+  <w:num w:numId="10">
+    <w:abstractNumId w:val="9"/>
+  </w:num>
+  <w:abstractNum w:abstractNumId="10">
+    <w:multiLevelType w:val="singleLevel"/>
+    <w:lvl w:ilvl="0">
+      <w:start w:val="1"/>
+      <w:numFmt w:val="decimal"/>
+      <w:lvlText w:val="%1."/>
+      <w:lvlJc w:val="left"/>
+      <w:pPr>
+        <w:tabs>
+          <w:tab w:val="num" w:pos="540"/>
+        </w:tabs>
+        <w:ind w:left="540" w:hanging="270"/>
+      </w:pPr>
+    </w:lvl>
+  </w:abstractNum>
+  <w:num w:numId="11">
+    <w:abstractNumId w:val="10"/>
+  </w:num>
+  <w:abstractNum w:abstractNumId="11">
+    <w:multiLevelType w:val="singleLevel"/>
+    <w:lvl w:ilvl="0">
+      <w:start w:val="1"/>
+      <w:numFmt w:val="bullet"/>
+      <w:lvlText w:val="•"/>
+      <w:lvlJc w:val="left"/>
+      <w:pPr>
+        <w:tabs>
+          <w:tab w:val="num" w:pos="540"/>
+        </w:tabs>
+        <w:ind w:left="540" w:hanging="270"/>
+      </w:pPr>
+    </w:lvl>
+  </w:abstractNum>
+  <w:num w:numId="12">
+    <w:abstractNumId w:val="11"/>
+  </w:num>
+  <w:abstractNum w:abstractNumId="12">
+    <w:multiLevelType w:val="singleLevel"/>
+    <w:lvl w:ilvl="0">
+      <w:start w:val="1"/>
+      <w:numFmt w:val="bullet"/>
+      <w:lvlText w:val="•"/>
+      <w:lvlJc w:val="left"/>
+      <w:pPr>
+        <w:tabs>
+          <w:tab w:val="num" w:pos="540"/>
+        </w:tabs>
+        <w:ind w:left="540" w:hanging="270"/>
+      </w:pPr>
+    </w:lvl>
+  </w:abstractNum>
+  <w:num w:numId="13">
+    <w:abstractNumId w:val="12"/>
+  </w:num>
+  <w:abstractNum w:abstractNumId="13">
+    <w:multiLevelType w:val="singleLevel"/>
+    <w:lvl w:ilvl="0">
+      <w:start w:val="1"/>
+      <w:numFmt w:val="bullet"/>
+      <w:lvlText w:val="•"/>
+      <w:lvlJc w:val="left"/>
+      <w:pPr>
+        <w:tabs>
+          <w:tab w:val="num" w:pos="540"/>
+        </w:tabs>
+        <w:ind w:left="540" w:hanging="270"/>
+      </w:pPr>
+    </w:lvl>
+  </w:abstractNum>
+  <w:num w:numId="14">
+    <w:abstractNumId w:val="13"/>
+  </w:num>
+  <w:abstractNum w:abstractNumId="14">
+    <w:multiLevelType w:val="singleLevel"/>
+    <w:lvl w:ilvl="0">
+      <w:start w:val="1"/>
+      <w:numFmt w:val="bullet"/>
+      <w:lvlText w:val="•"/>
+      <w:lvlJc w:val="left"/>
+      <w:pPr>
+        <w:tabs>
+          <w:tab w:val="num" w:pos="540"/>
+        </w:tabs>
+        <w:ind w:left="540" w:hanging="270"/>
+      </w:pPr>
+    </w:lvl>
+  </w:abstractNum>
+  <w:num w:numId="15">
+    <w:abstractNumId w:val="14"/>
+  </w:num>
+  <w:abstractNum w:abstractNumId="15">
+    <w:multiLevelType w:val="singleLevel"/>
+    <w:lvl w:ilvl="0">
+      <w:start w:val="1"/>
+      <w:numFmt w:val="bullet"/>
+      <w:lvlText w:val="•"/>
+      <w:lvlJc w:val="left"/>
+      <w:pPr>
+        <w:tabs>
+          <w:tab w:val="num" w:pos="540"/>
+        </w:tabs>
+        <w:ind w:left="540" w:hanging="270"/>
+      </w:pPr>
+    </w:lvl>
+  </w:abstractNum>
+  <w:num w:numId="16">
+    <w:abstractNumId w:val="15"/>
+  </w:num>
+  <w:abstractNum w:abstractNumId="16">
+    <w:multiLevelType w:val="singleLevel"/>
+    <w:lvl w:ilvl="0">
+      <w:start w:val="1"/>
+      <w:numFmt w:val="decimal"/>
+      <w:lvlText w:val="%1."/>
+      <w:lvlJc w:val="left"/>
+      <w:pPr>
+        <w:tabs>
+          <w:tab w:val="num" w:pos="540"/>
+        </w:tabs>
+        <w:ind w:left="540" w:hanging="270"/>
+      </w:pPr>
+    </w:lvl>
+  </w:abstractNum>
+  <w:num w:numId="17">
+    <w:abstractNumId w:val="16"/>
   </w:num>
 </w:numbering>
 </file>
@@ -1252,7 +2731,7 @@
     <w:qFormat/>
     <w:rsid w:val="00FC693F"/>
     <w:pPr>
-      <w:spacing w:before="0" w:after="120" w:line="300" w:lineRule="auto"/>
+      <w:spacing w:after="120" w:line="300" w:lineRule="auto"/>
     </w:pPr>
     <w:rPr>
       <w:rFonts w:ascii="Calibri" w:hAnsi="Calibri"/>
@@ -1546,13 +3025,8 @@
     <w:qFormat/>
     <w:rsid w:val="00FC693F"/>
     <w:pPr>
-      <w:spacing w:after="160" w:line="240" w:lineRule="auto"/>
-      <w:ind w:left="259"/>
-    </w:pPr>
-    <w:rPr>
-      <w:rFonts w:ascii="Consolas" w:hAnsi="Consolas"/>
-      <w:sz w:val="18"/>
-    </w:rPr>
+      <w:spacing w:after="0" w:line="240" w:lineRule="auto"/>
+    </w:pPr>
   </w:style>
   <w:style w:type="character" w:customStyle="1" w:styleId="Heading1Char">
     <w:name w:val="Heading 1 Char"/>
@@ -1606,18 +3080,20 @@
     <w:qFormat/>
     <w:rsid w:val="00FC693F"/>
     <w:pPr>
+      <w:keepNext/>
       <w:pBdr>
         <w:bottom w:val="single" w:sz="8" w:space="4" w:color="4F81BD" w:themeColor="accent1"/>
       </w:pBdr>
-      <w:spacing w:after="300" w:line="240" w:lineRule="auto"/>
+      <w:spacing w:after="160" w:line="240" w:lineRule="auto" w:before="0"/>
       <w:contextualSpacing/>
     </w:pPr>
     <w:rPr>
-      <w:rFonts w:asciiTheme="majorHAnsi" w:eastAsiaTheme="majorEastAsia" w:hAnsiTheme="majorHAnsi" w:cstheme="majorBidi"/>
-      <w:color w:val="17365D" w:themeColor="text2" w:themeShade="BF"/>
+      <w:rFonts w:asciiTheme="majorHAnsi" w:eastAsiaTheme="majorEastAsia" w:hAnsiTheme="majorHAnsi" w:cstheme="majorBidi" w:ascii="Calibri" w:hAnsi="Calibri"/>
+      <w:b/>
+      <w:color w:val="2E74B5"/>
       <w:spacing w:val="5"/>
       <w:kern w:val="28"/>
-      <w:sz w:val="52"/>
+      <w:sz w:val="48"/>
       <w:szCs w:val="52"/>
     </w:rPr>
   </w:style>
@@ -1791,14 +3267,8 @@
       <w:numPr>
         <w:numId w:val="1"/>
       </w:numPr>
-      <w:spacing w:after="80" w:line="300" w:lineRule="auto"/>
-      <w:ind w:left="540" w:hanging="271"/>
       <w:contextualSpacing/>
     </w:pPr>
-    <w:rPr>
-      <w:rFonts w:ascii="Calibri" w:hAnsi="Calibri"/>
-      <w:sz w:val="22"/>
-    </w:rPr>
   </w:style>
   <w:style w:type="paragraph" w:styleId="ListBullet2">
     <w:name w:val="List Bullet 2"/>
@@ -1836,14 +3306,8 @@
       <w:numPr>
         <w:numId w:val="5"/>
       </w:numPr>
-      <w:spacing w:after="80" w:line="300" w:lineRule="auto"/>
-      <w:ind w:left="540" w:hanging="271"/>
       <w:contextualSpacing/>
     </w:pPr>
-    <w:rPr>
-      <w:rFonts w:ascii="Calibri" w:hAnsi="Calibri"/>
-      <w:sz w:val="22"/>
-    </w:rPr>
   </w:style>
   <w:style w:type="paragraph" w:styleId="ListNumber2">
     <w:name w:val="List Number 2"/>

</xml_diff>

<commit_message>
Améliorer la disposition GUI et les contrôles anthropométriques
</commit_message>
<xml_diff>
--- a/Labo/Guide_etudiant_labo_squat.docx
+++ b/Labo/Guide_etudiant_labo_squat.docx
@@ -356,7 +356,7 @@
         </w:numPr>
       </w:pPr>
       <w:r>
-        <w:t xml:space="preserve">Choisir un profil temporel : </w:t>
+        <w:t xml:space="preserve">Choisir un profil temporel : le sélecteur affiche les durées sous la forme </w:t>
       </w:r>
       <w:r>
         <w:rPr>
@@ -364,7 +364,18 @@
           <w:color w:val="1F4D78"/>
           <w:sz w:val="19"/>
         </w:rPr>
-        <w:t>Référence 4/2/4</w:t>
+        <w:t>descente | isométrique | montée</w:t>
+      </w:r>
+      <w:r>
+        <w:t xml:space="preserve">, par exemple </w:t>
+      </w:r>
+      <w:r>
+        <w:rPr>
+          <w:rFonts w:ascii="Aptos Mono" w:hAnsi="Aptos Mono"/>
+          <w:color w:val="1F4D78"/>
+          <w:sz w:val="19"/>
+        </w:rPr>
+        <w:t>Référence — 4 | 2 | 4 s</w:t>
       </w:r>
       <w:r>
         <w:t xml:space="preserve">, </w:t>
@@ -375,7 +386,7 @@
           <w:color w:val="1F4D78"/>
           <w:sz w:val="19"/>
         </w:rPr>
-        <w:t>Lent 6/2/6</w:t>
+        <w:t>Lent — 4 | 2 | 2 s</w:t>
       </w:r>
       <w:r>
         <w:t xml:space="preserve">, </w:t>
@@ -386,7 +397,7 @@
           <w:color w:val="1F4D78"/>
           <w:sz w:val="19"/>
         </w:rPr>
-        <w:t>Rapide 2/0,5/2</w:t>
+        <w:t>Rapide — 0,5 | 0,5 | 0,5 s</w:t>
       </w:r>
       <w:r>
         <w:t xml:space="preserve">, </w:t>
@@ -397,7 +408,7 @@
           <w:color w:val="1F4D78"/>
           <w:sz w:val="19"/>
         </w:rPr>
-        <w:t>Sans pause 4/0/4</w:t>
+        <w:t>Sans pause — 4 | 0 | 4 s</w:t>
       </w:r>
       <w:r>
         <w:t xml:space="preserve">, </w:t>
@@ -408,7 +419,7 @@
           <w:color w:val="1F4D78"/>
           <w:sz w:val="19"/>
         </w:rPr>
-        <w:t>Descente lente / montée rapide 6/1/2</w:t>
+        <w:t>Descente lente / montée rapide — 4 | 1 | 0,5 s</w:t>
       </w:r>
       <w:r>
         <w:t xml:space="preserve"> ou </w:t>
@@ -419,7 +430,7 @@
           <w:color w:val="1F4D78"/>
           <w:sz w:val="19"/>
         </w:rPr>
-        <w:t>Descente rapide / montée lente 2/1/6</w:t>
+        <w:t>Descente rapide / montée lente — 0,5 | 1 | 4 s</w:t>
       </w:r>
       <w:r>
         <w:t>.</w:t>
@@ -1209,7 +1220,7 @@
     </w:p>
     <w:p>
       <w:r>
-        <w:t>Étape de conception : ouvrir les conditions les plus critiques dans le GUI, ajuster les angles de la position de squat jusqu’à conserver le ZMP dans la zone d’appui, puis enregistrer la condition adaptée. La zone retenue exclut les 15 % postérieurs de la projection du pied : le bord du talon constitue une alerte, même si le point est encore sous la silhouette du pied. Avec le wedge, la limite postérieure est la projection verticale de la cheville pour écarter les appuis excessivement postérieurs sur le talon surélevé. Rapporter les changements d’angles nécessaires et leurs conséquences sur les couples.</w:t>
+        <w:t>Étape de conception : ouvrir les conditions les plus critiques dans le GUI, ajuster les angles de la position de squat jusqu’à conserver le ZMP dans la zone d’appui, puis enregistrer la condition adaptée. La base géométrique couvre toute la longueur projetée du pied, du talon aux orteils. La zone fonctionnelle retenue va de la projection de la cheville à la tête des métatarsiens, modélisée à 85 % du segment talon–orteils; les orteils distaux restent hors de la zone fonctionnelle. Rapporter les changements d’angles nécessaires et leurs conséquences sur les couples.</w:t>
       </w:r>
     </w:p>
     <w:p>
@@ -1417,7 +1428,7 @@
           <w:color w:val="1F4D78"/>
           <w:sz w:val="19"/>
         </w:rPr>
-        <w:t>Lent 6/2/6</w:t>
+        <w:t>Lent 4/2/2</w:t>
       </w:r>
       <w:r>
         <w:t xml:space="preserve"> et </w:t>
@@ -1428,7 +1439,7 @@
           <w:color w:val="1F4D78"/>
           <w:sz w:val="19"/>
         </w:rPr>
-        <w:t>Rapide 2/0,5/2</w:t>
+        <w:t>Rapide 0,5/0,5/0,5</w:t>
       </w:r>
       <w:r>
         <w:t>, puis utiliser le curseur synchronisé pour comparer les mêmes événements du mouvement.</w:t>

</xml_diff>